<commit_message>
Methodology doc: add appendix with digitized iso-FN line coefficients
Co-Authored-By: Claude Fable 5 <noreply@anthropic.com>
</commit_message>
<xml_diff>
--- a/WRC-1992-diagram-methodology.docx
+++ b/WRC-1992-diagram-methodology.docx
@@ -2416,6 +2416,3738 @@
     <w:p>
       <w:pPr>
         <w:pStyle w:val="Heading1"/>
+        <w:pageBreakBefore/>
+      </w:pPr>
+      <w:r>
+        <w:t xml:space="preserve">Appendix: Digitized iso-FN line coefficients</w:t>
+      </w:r>
+    </w:p>
+    <w:p>
+      <w:pPr>
+        <w:spacing w:after="160"/>
+      </w:pPr>
+      <w:r>
+        <w:t xml:space="preserve">The 29 solid iso-FN lines are straight in the (Cr</w:t>
+      </w:r>
+      <w:r>
+        <w:rPr>
+          <w:vertAlign w:val="subscript"/>
+        </w:rPr>
+        <w:t xml:space="preserve">eq</w:t>
+      </w:r>
+      <w:r>
+        <w:t xml:space="preserve">, Ni</w:t>
+      </w:r>
+      <w:r>
+        <w:rPr>
+          <w:vertAlign w:val="subscript"/>
+        </w:rPr>
+        <w:t xml:space="preserve">eq</w:t>
+      </w:r>
+      <w:r>
+        <w:t xml:space="preserve">) plane, so each can be written exactly as</w:t>
+      </w:r>
+    </w:p>
+    <w:p>
+      <w:pPr>
+        <w:spacing w:after="200"/>
+        <w:jc w:val="center"/>
+      </w:pPr>
+      <w:r>
+        <w:t xml:space="preserve">Ni</w:t>
+      </w:r>
+      <w:r>
+        <w:rPr>
+          <w:vertAlign w:val="subscript"/>
+        </w:rPr>
+        <w:t xml:space="preserve">eq</w:t>
+      </w:r>
+      <w:r>
+        <w:t xml:space="preserve"> = a + b·</w:t>
+      </w:r>
+      <w:r>
+        <w:t xml:space="preserve">Cr</w:t>
+      </w:r>
+      <w:r>
+        <w:rPr>
+          <w:vertAlign w:val="subscript"/>
+        </w:rPr>
+        <w:t xml:space="preserve">eq</w:t>
+      </w:r>
+    </w:p>
+    <w:p>
+      <w:pPr>
+        <w:spacing w:after="160"/>
+      </w:pPr>
+      <w:r>
+        <w:t xml:space="preserve">The coefficients below are computed from the digitized endpoints. The slope falls monotonically from about 1.21 at FN 2 to about 0.47 at FN 100 — the fan shape of the diagram expressed numerically.</w:t>
+      </w:r>
+    </w:p>
+    <w:tbl>
+      <w:tblPr>
+        <w:tblW w:type="dxa" w:w="9026"/>
+        <w:tblBorders>
+          <w:top w:val="single" w:color="auto" w:sz="4"/>
+          <w:left w:val="single" w:color="auto" w:sz="4"/>
+          <w:bottom w:val="single" w:color="auto" w:sz="4"/>
+          <w:right w:val="single" w:color="auto" w:sz="4"/>
+          <w:insideH w:val="single" w:color="auto" w:sz="4"/>
+          <w:insideV w:val="single" w:color="auto" w:sz="4"/>
+        </w:tblBorders>
+      </w:tblPr>
+      <w:tblGrid>
+        <w:gridCol w:w="900"/>
+        <w:gridCol w:w="1600"/>
+        <w:gridCol w:w="1700"/>
+        <w:gridCol w:w="4826"/>
+      </w:tblGrid>
+      <w:tr>
+        <w:tc>
+          <w:tcPr>
+            <w:tcW w:type="dxa" w:w="900"/>
+            <w:tcBorders>
+              <w:top w:val="single" w:color="BBBBBB" w:sz="1"/>
+              <w:left w:val="single" w:color="BBBBBB" w:sz="1"/>
+              <w:bottom w:val="single" w:color="BBBBBB" w:sz="1"/>
+              <w:right w:val="single" w:color="BBBBBB" w:sz="1"/>
+            </w:tcBorders>
+            <w:shd w:fill="E4F1F8" w:val="clear"/>
+            <w:tcMar>
+              <w:top w:type="dxa" w:w="80"/>
+              <w:left w:type="dxa" w:w="120"/>
+              <w:bottom w:type="dxa" w:w="80"/>
+              <w:right w:type="dxa" w:w="120"/>
+            </w:tcMar>
+          </w:tcPr>
+          <w:p>
+            <w:r>
+              <w:rPr>
+                <w:b/>
+                <w:bCs/>
+                <w:sz w:val="20"/>
+                <w:szCs w:val="20"/>
+              </w:rPr>
+              <w:t xml:space="preserve">FN</w:t>
+            </w:r>
+          </w:p>
+        </w:tc>
+        <w:tc>
+          <w:tcPr>
+            <w:tcW w:type="dxa" w:w="1600"/>
+            <w:tcBorders>
+              <w:top w:val="single" w:color="BBBBBB" w:sz="1"/>
+              <w:left w:val="single" w:color="BBBBBB" w:sz="1"/>
+              <w:bottom w:val="single" w:color="BBBBBB" w:sz="1"/>
+              <w:right w:val="single" w:color="BBBBBB" w:sz="1"/>
+            </w:tcBorders>
+            <w:shd w:fill="E4F1F8" w:val="clear"/>
+            <w:tcMar>
+              <w:top w:type="dxa" w:w="80"/>
+              <w:left w:type="dxa" w:w="120"/>
+              <w:bottom w:type="dxa" w:w="80"/>
+              <w:right w:type="dxa" w:w="120"/>
+            </w:tcMar>
+          </w:tcPr>
+          <w:p>
+            <w:r>
+              <w:rPr>
+                <w:b/>
+                <w:bCs/>
+                <w:sz w:val="20"/>
+                <w:szCs w:val="20"/>
+              </w:rPr>
+              <w:t xml:space="preserve">Slope b</w:t>
+            </w:r>
+          </w:p>
+        </w:tc>
+        <w:tc>
+          <w:tcPr>
+            <w:tcW w:type="dxa" w:w="1700"/>
+            <w:tcBorders>
+              <w:top w:val="single" w:color="BBBBBB" w:sz="1"/>
+              <w:left w:val="single" w:color="BBBBBB" w:sz="1"/>
+              <w:bottom w:val="single" w:color="BBBBBB" w:sz="1"/>
+              <w:right w:val="single" w:color="BBBBBB" w:sz="1"/>
+            </w:tcBorders>
+            <w:shd w:fill="E4F1F8" w:val="clear"/>
+            <w:tcMar>
+              <w:top w:type="dxa" w:w="80"/>
+              <w:left w:type="dxa" w:w="120"/>
+              <w:bottom w:type="dxa" w:w="80"/>
+              <w:right w:type="dxa" w:w="120"/>
+            </w:tcMar>
+          </w:tcPr>
+          <w:p>
+            <w:r>
+              <w:rPr>
+                <w:b/>
+                <w:bCs/>
+                <w:sz w:val="20"/>
+                <w:szCs w:val="20"/>
+              </w:rPr>
+              <w:t xml:space="preserve">Intercept a</w:t>
+            </w:r>
+          </w:p>
+        </w:tc>
+        <w:tc>
+          <w:tcPr>
+            <w:tcW w:type="dxa" w:w="4826"/>
+            <w:tcBorders>
+              <w:top w:val="single" w:color="BBBBBB" w:sz="1"/>
+              <w:left w:val="single" w:color="BBBBBB" w:sz="1"/>
+              <w:bottom w:val="single" w:color="BBBBBB" w:sz="1"/>
+              <w:right w:val="single" w:color="BBBBBB" w:sz="1"/>
+            </w:tcBorders>
+            <w:shd w:fill="E4F1F8" w:val="clear"/>
+            <w:tcMar>
+              <w:top w:type="dxa" w:w="80"/>
+              <w:left w:type="dxa" w:w="120"/>
+              <w:bottom w:type="dxa" w:w="80"/>
+              <w:right w:type="dxa" w:w="120"/>
+            </w:tcMar>
+          </w:tcPr>
+          <w:p>
+            <w:r>
+              <w:rPr>
+                <w:b/>
+                <w:bCs/>
+                <w:sz w:val="20"/>
+                <w:szCs w:val="20"/>
+              </w:rPr>
+              <w:t xml:space="preserve">Drawn extent (start → end)</w:t>
+            </w:r>
+          </w:p>
+        </w:tc>
+      </w:tr>
+      <w:tr>
+        <w:tc>
+          <w:tcPr>
+            <w:tcW w:type="dxa" w:w="900"/>
+            <w:tcBorders>
+              <w:top w:val="single" w:color="BBBBBB" w:sz="1"/>
+              <w:left w:val="single" w:color="BBBBBB" w:sz="1"/>
+              <w:bottom w:val="single" w:color="BBBBBB" w:sz="1"/>
+              <w:right w:val="single" w:color="BBBBBB" w:sz="1"/>
+            </w:tcBorders>
+            <w:tcMar>
+              <w:top w:type="dxa" w:w="80"/>
+              <w:left w:type="dxa" w:w="120"/>
+              <w:bottom w:type="dxa" w:w="80"/>
+              <w:right w:type="dxa" w:w="120"/>
+            </w:tcMar>
+          </w:tcPr>
+          <w:p>
+            <w:pPr>
+              <w:jc w:val="left"/>
+            </w:pPr>
+            <w:r>
+              <w:rPr>
+                <w:sz w:val="20"/>
+                <w:szCs w:val="20"/>
+              </w:rPr>
+              <w:t xml:space="preserve">2</w:t>
+            </w:r>
+          </w:p>
+        </w:tc>
+        <w:tc>
+          <w:tcPr>
+            <w:tcW w:type="dxa" w:w="1600"/>
+            <w:tcBorders>
+              <w:top w:val="single" w:color="BBBBBB" w:sz="1"/>
+              <w:left w:val="single" w:color="BBBBBB" w:sz="1"/>
+              <w:bottom w:val="single" w:color="BBBBBB" w:sz="1"/>
+              <w:right w:val="single" w:color="BBBBBB" w:sz="1"/>
+            </w:tcBorders>
+            <w:tcMar>
+              <w:top w:type="dxa" w:w="80"/>
+              <w:left w:type="dxa" w:w="120"/>
+              <w:bottom w:type="dxa" w:w="80"/>
+              <w:right w:type="dxa" w:w="120"/>
+            </w:tcMar>
+          </w:tcPr>
+          <w:p>
+            <w:pPr>
+              <w:jc w:val="right"/>
+            </w:pPr>
+            <w:r>
+              <w:rPr>
+                <w:sz w:val="20"/>
+                <w:szCs w:val="20"/>
+              </w:rPr>
+              <w:t xml:space="preserve">1.2094</w:t>
+            </w:r>
+          </w:p>
+        </w:tc>
+        <w:tc>
+          <w:tcPr>
+            <w:tcW w:type="dxa" w:w="1700"/>
+            <w:tcBorders>
+              <w:top w:val="single" w:color="BBBBBB" w:sz="1"/>
+              <w:left w:val="single" w:color="BBBBBB" w:sz="1"/>
+              <w:bottom w:val="single" w:color="BBBBBB" w:sz="1"/>
+              <w:right w:val="single" w:color="BBBBBB" w:sz="1"/>
+            </w:tcBorders>
+            <w:tcMar>
+              <w:top w:type="dxa" w:w="80"/>
+              <w:left w:type="dxa" w:w="120"/>
+              <w:bottom w:type="dxa" w:w="80"/>
+              <w:right w:type="dxa" w:w="120"/>
+            </w:tcMar>
+          </w:tcPr>
+          <w:p>
+            <w:pPr>
+              <w:jc w:val="right"/>
+            </w:pPr>
+            <w:r>
+              <w:rPr>
+                <w:sz w:val="20"/>
+                <w:szCs w:val="20"/>
+              </w:rPr>
+              <w:t xml:space="preserve">-9.708</w:t>
+            </w:r>
+          </w:p>
+        </w:tc>
+        <w:tc>
+          <w:tcPr>
+            <w:tcW w:type="dxa" w:w="4826"/>
+            <w:tcBorders>
+              <w:top w:val="single" w:color="BBBBBB" w:sz="1"/>
+              <w:left w:val="single" w:color="BBBBBB" w:sz="1"/>
+              <w:bottom w:val="single" w:color="BBBBBB" w:sz="1"/>
+              <w:right w:val="single" w:color="BBBBBB" w:sz="1"/>
+            </w:tcBorders>
+            <w:tcMar>
+              <w:top w:type="dxa" w:w="80"/>
+              <w:left w:type="dxa" w:w="120"/>
+              <w:bottom w:type="dxa" w:w="80"/>
+              <w:right w:type="dxa" w:w="120"/>
+            </w:tcMar>
+          </w:tcPr>
+          <w:p>
+            <w:pPr>
+              <w:jc w:val="left"/>
+            </w:pPr>
+            <w:r>
+              <w:rPr>
+                <w:sz w:val="20"/>
+                <w:szCs w:val="20"/>
+              </w:rPr>
+              <w:t xml:space="preserve">(17.04, 10.90) → (22.15, 17.08)</w:t>
+            </w:r>
+          </w:p>
+        </w:tc>
+      </w:tr>
+      <w:tr>
+        <w:tc>
+          <w:tcPr>
+            <w:tcW w:type="dxa" w:w="900"/>
+            <w:tcBorders>
+              <w:top w:val="single" w:color="BBBBBB" w:sz="1"/>
+              <w:left w:val="single" w:color="BBBBBB" w:sz="1"/>
+              <w:bottom w:val="single" w:color="BBBBBB" w:sz="1"/>
+              <w:right w:val="single" w:color="BBBBBB" w:sz="1"/>
+            </w:tcBorders>
+            <w:tcMar>
+              <w:top w:type="dxa" w:w="80"/>
+              <w:left w:type="dxa" w:w="120"/>
+              <w:bottom w:type="dxa" w:w="80"/>
+              <w:right w:type="dxa" w:w="120"/>
+            </w:tcMar>
+          </w:tcPr>
+          <w:p>
+            <w:pPr>
+              <w:jc w:val="left"/>
+            </w:pPr>
+            <w:r>
+              <w:rPr>
+                <w:sz w:val="20"/>
+                <w:szCs w:val="20"/>
+              </w:rPr>
+              <w:t xml:space="preserve">4</w:t>
+            </w:r>
+          </w:p>
+        </w:tc>
+        <w:tc>
+          <w:tcPr>
+            <w:tcW w:type="dxa" w:w="1600"/>
+            <w:tcBorders>
+              <w:top w:val="single" w:color="BBBBBB" w:sz="1"/>
+              <w:left w:val="single" w:color="BBBBBB" w:sz="1"/>
+              <w:bottom w:val="single" w:color="BBBBBB" w:sz="1"/>
+              <w:right w:val="single" w:color="BBBBBB" w:sz="1"/>
+            </w:tcBorders>
+            <w:tcMar>
+              <w:top w:type="dxa" w:w="80"/>
+              <w:left w:type="dxa" w:w="120"/>
+              <w:bottom w:type="dxa" w:w="80"/>
+              <w:right w:type="dxa" w:w="120"/>
+            </w:tcMar>
+          </w:tcPr>
+          <w:p>
+            <w:pPr>
+              <w:jc w:val="right"/>
+            </w:pPr>
+            <w:r>
+              <w:rPr>
+                <w:sz w:val="20"/>
+                <w:szCs w:val="20"/>
+              </w:rPr>
+              <w:t xml:space="preserve">1.1791</w:t>
+            </w:r>
+          </w:p>
+        </w:tc>
+        <w:tc>
+          <w:tcPr>
+            <w:tcW w:type="dxa" w:w="1700"/>
+            <w:tcBorders>
+              <w:top w:val="single" w:color="BBBBBB" w:sz="1"/>
+              <w:left w:val="single" w:color="BBBBBB" w:sz="1"/>
+              <w:bottom w:val="single" w:color="BBBBBB" w:sz="1"/>
+              <w:right w:val="single" w:color="BBBBBB" w:sz="1"/>
+            </w:tcBorders>
+            <w:tcMar>
+              <w:top w:type="dxa" w:w="80"/>
+              <w:left w:type="dxa" w:w="120"/>
+              <w:bottom w:type="dxa" w:w="80"/>
+              <w:right w:type="dxa" w:w="120"/>
+            </w:tcMar>
+          </w:tcPr>
+          <w:p>
+            <w:pPr>
+              <w:jc w:val="right"/>
+            </w:pPr>
+            <w:r>
+              <w:rPr>
+                <w:sz w:val="20"/>
+                <w:szCs w:val="20"/>
+              </w:rPr>
+              <w:t xml:space="preserve">-10.152</w:t>
+            </w:r>
+          </w:p>
+        </w:tc>
+        <w:tc>
+          <w:tcPr>
+            <w:tcW w:type="dxa" w:w="4826"/>
+            <w:tcBorders>
+              <w:top w:val="single" w:color="BBBBBB" w:sz="1"/>
+              <w:left w:val="single" w:color="BBBBBB" w:sz="1"/>
+              <w:bottom w:val="single" w:color="BBBBBB" w:sz="1"/>
+              <w:right w:val="single" w:color="BBBBBB" w:sz="1"/>
+            </w:tcBorders>
+            <w:tcMar>
+              <w:top w:type="dxa" w:w="80"/>
+              <w:left w:type="dxa" w:w="120"/>
+              <w:bottom w:type="dxa" w:w="80"/>
+              <w:right w:type="dxa" w:w="120"/>
+            </w:tcMar>
+          </w:tcPr>
+          <w:p>
+            <w:pPr>
+              <w:jc w:val="left"/>
+            </w:pPr>
+            <w:r>
+              <w:rPr>
+                <w:sz w:val="20"/>
+                <w:szCs w:val="20"/>
+              </w:rPr>
+              <w:t xml:space="preserve">(17.04, 9.94) → (23.07, 17.05)</w:t>
+            </w:r>
+          </w:p>
+        </w:tc>
+      </w:tr>
+      <w:tr>
+        <w:tc>
+          <w:tcPr>
+            <w:tcW w:type="dxa" w:w="900"/>
+            <w:tcBorders>
+              <w:top w:val="single" w:color="BBBBBB" w:sz="1"/>
+              <w:left w:val="single" w:color="BBBBBB" w:sz="1"/>
+              <w:bottom w:val="single" w:color="BBBBBB" w:sz="1"/>
+              <w:right w:val="single" w:color="BBBBBB" w:sz="1"/>
+            </w:tcBorders>
+            <w:tcMar>
+              <w:top w:type="dxa" w:w="80"/>
+              <w:left w:type="dxa" w:w="120"/>
+              <w:bottom w:type="dxa" w:w="80"/>
+              <w:right w:type="dxa" w:w="120"/>
+            </w:tcMar>
+          </w:tcPr>
+          <w:p>
+            <w:pPr>
+              <w:jc w:val="left"/>
+            </w:pPr>
+            <w:r>
+              <w:rPr>
+                <w:sz w:val="20"/>
+                <w:szCs w:val="20"/>
+              </w:rPr>
+              <w:t xml:space="preserve">6</w:t>
+            </w:r>
+          </w:p>
+        </w:tc>
+        <w:tc>
+          <w:tcPr>
+            <w:tcW w:type="dxa" w:w="1600"/>
+            <w:tcBorders>
+              <w:top w:val="single" w:color="BBBBBB" w:sz="1"/>
+              <w:left w:val="single" w:color="BBBBBB" w:sz="1"/>
+              <w:bottom w:val="single" w:color="BBBBBB" w:sz="1"/>
+              <w:right w:val="single" w:color="BBBBBB" w:sz="1"/>
+            </w:tcBorders>
+            <w:tcMar>
+              <w:top w:type="dxa" w:w="80"/>
+              <w:left w:type="dxa" w:w="120"/>
+              <w:bottom w:type="dxa" w:w="80"/>
+              <w:right w:type="dxa" w:w="120"/>
+            </w:tcMar>
+          </w:tcPr>
+          <w:p>
+            <w:pPr>
+              <w:jc w:val="right"/>
+            </w:pPr>
+            <w:r>
+              <w:rPr>
+                <w:sz w:val="20"/>
+                <w:szCs w:val="20"/>
+              </w:rPr>
+              <w:t xml:space="preserve">1.1348</w:t>
+            </w:r>
+          </w:p>
+        </w:tc>
+        <w:tc>
+          <w:tcPr>
+            <w:tcW w:type="dxa" w:w="1700"/>
+            <w:tcBorders>
+              <w:top w:val="single" w:color="BBBBBB" w:sz="1"/>
+              <w:left w:val="single" w:color="BBBBBB" w:sz="1"/>
+              <w:bottom w:val="single" w:color="BBBBBB" w:sz="1"/>
+              <w:right w:val="single" w:color="BBBBBB" w:sz="1"/>
+            </w:tcBorders>
+            <w:tcMar>
+              <w:top w:type="dxa" w:w="80"/>
+              <w:left w:type="dxa" w:w="120"/>
+              <w:bottom w:type="dxa" w:w="80"/>
+              <w:right w:type="dxa" w:w="120"/>
+            </w:tcMar>
+          </w:tcPr>
+          <w:p>
+            <w:pPr>
+              <w:jc w:val="right"/>
+            </w:pPr>
+            <w:r>
+              <w:rPr>
+                <w:sz w:val="20"/>
+                <w:szCs w:val="20"/>
+              </w:rPr>
+              <w:t xml:space="preserve">-9.818</w:t>
+            </w:r>
+          </w:p>
+        </w:tc>
+        <w:tc>
+          <w:tcPr>
+            <w:tcW w:type="dxa" w:w="4826"/>
+            <w:tcBorders>
+              <w:top w:val="single" w:color="BBBBBB" w:sz="1"/>
+              <w:left w:val="single" w:color="BBBBBB" w:sz="1"/>
+              <w:bottom w:val="single" w:color="BBBBBB" w:sz="1"/>
+              <w:right w:val="single" w:color="BBBBBB" w:sz="1"/>
+            </w:tcBorders>
+            <w:tcMar>
+              <w:top w:type="dxa" w:w="80"/>
+              <w:left w:type="dxa" w:w="120"/>
+              <w:bottom w:type="dxa" w:w="80"/>
+              <w:right w:type="dxa" w:w="120"/>
+            </w:tcMar>
+          </w:tcPr>
+          <w:p>
+            <w:pPr>
+              <w:jc w:val="left"/>
+            </w:pPr>
+            <w:r>
+              <w:rPr>
+                <w:sz w:val="20"/>
+                <w:szCs w:val="20"/>
+              </w:rPr>
+              <w:t xml:space="preserve">(17.04, 9.52) → (23.64, 17.01)</w:t>
+            </w:r>
+          </w:p>
+        </w:tc>
+      </w:tr>
+      <w:tr>
+        <w:tc>
+          <w:tcPr>
+            <w:tcW w:type="dxa" w:w="900"/>
+            <w:tcBorders>
+              <w:top w:val="single" w:color="BBBBBB" w:sz="1"/>
+              <w:left w:val="single" w:color="BBBBBB" w:sz="1"/>
+              <w:bottom w:val="single" w:color="BBBBBB" w:sz="1"/>
+              <w:right w:val="single" w:color="BBBBBB" w:sz="1"/>
+            </w:tcBorders>
+            <w:tcMar>
+              <w:top w:type="dxa" w:w="80"/>
+              <w:left w:type="dxa" w:w="120"/>
+              <w:bottom w:type="dxa" w:w="80"/>
+              <w:right w:type="dxa" w:w="120"/>
+            </w:tcMar>
+          </w:tcPr>
+          <w:p>
+            <w:pPr>
+              <w:jc w:val="left"/>
+            </w:pPr>
+            <w:r>
+              <w:rPr>
+                <w:sz w:val="20"/>
+                <w:szCs w:val="20"/>
+              </w:rPr>
+              <w:t xml:space="preserve">8</w:t>
+            </w:r>
+          </w:p>
+        </w:tc>
+        <w:tc>
+          <w:tcPr>
+            <w:tcW w:type="dxa" w:w="1600"/>
+            <w:tcBorders>
+              <w:top w:val="single" w:color="BBBBBB" w:sz="1"/>
+              <w:left w:val="single" w:color="BBBBBB" w:sz="1"/>
+              <w:bottom w:val="single" w:color="BBBBBB" w:sz="1"/>
+              <w:right w:val="single" w:color="BBBBBB" w:sz="1"/>
+            </w:tcBorders>
+            <w:tcMar>
+              <w:top w:type="dxa" w:w="80"/>
+              <w:left w:type="dxa" w:w="120"/>
+              <w:bottom w:type="dxa" w:w="80"/>
+              <w:right w:type="dxa" w:w="120"/>
+            </w:tcMar>
+          </w:tcPr>
+          <w:p>
+            <w:pPr>
+              <w:jc w:val="right"/>
+            </w:pPr>
+            <w:r>
+              <w:rPr>
+                <w:sz w:val="20"/>
+                <w:szCs w:val="20"/>
+              </w:rPr>
+              <w:t xml:space="preserve">1.1026</w:t>
+            </w:r>
+          </w:p>
+        </w:tc>
+        <w:tc>
+          <w:tcPr>
+            <w:tcW w:type="dxa" w:w="1700"/>
+            <w:tcBorders>
+              <w:top w:val="single" w:color="BBBBBB" w:sz="1"/>
+              <w:left w:val="single" w:color="BBBBBB" w:sz="1"/>
+              <w:bottom w:val="single" w:color="BBBBBB" w:sz="1"/>
+              <w:right w:val="single" w:color="BBBBBB" w:sz="1"/>
+            </w:tcBorders>
+            <w:tcMar>
+              <w:top w:type="dxa" w:w="80"/>
+              <w:left w:type="dxa" w:w="120"/>
+              <w:bottom w:type="dxa" w:w="80"/>
+              <w:right w:type="dxa" w:w="120"/>
+            </w:tcMar>
+          </w:tcPr>
+          <w:p>
+            <w:pPr>
+              <w:jc w:val="right"/>
+            </w:pPr>
+            <w:r>
+              <w:rPr>
+                <w:sz w:val="20"/>
+                <w:szCs w:val="20"/>
+              </w:rPr>
+              <w:t xml:space="preserve">-9.795</w:t>
+            </w:r>
+          </w:p>
+        </w:tc>
+        <w:tc>
+          <w:tcPr>
+            <w:tcW w:type="dxa" w:w="4826"/>
+            <w:tcBorders>
+              <w:top w:val="single" w:color="BBBBBB" w:sz="1"/>
+              <w:left w:val="single" w:color="BBBBBB" w:sz="1"/>
+              <w:bottom w:val="single" w:color="BBBBBB" w:sz="1"/>
+              <w:right w:val="single" w:color="BBBBBB" w:sz="1"/>
+            </w:tcBorders>
+            <w:tcMar>
+              <w:top w:type="dxa" w:w="80"/>
+              <w:left w:type="dxa" w:w="120"/>
+              <w:bottom w:type="dxa" w:w="80"/>
+              <w:right w:type="dxa" w:w="120"/>
+            </w:tcMar>
+          </w:tcPr>
+          <w:p>
+            <w:pPr>
+              <w:jc w:val="left"/>
+            </w:pPr>
+            <w:r>
+              <w:rPr>
+                <w:sz w:val="20"/>
+                <w:szCs w:val="20"/>
+              </w:rPr>
+              <w:t xml:space="preserve">(17.10, 9.06) → (24.31, 17.01)</w:t>
+            </w:r>
+          </w:p>
+        </w:tc>
+      </w:tr>
+      <w:tr>
+        <w:tc>
+          <w:tcPr>
+            <w:tcW w:type="dxa" w:w="900"/>
+            <w:tcBorders>
+              <w:top w:val="single" w:color="BBBBBB" w:sz="1"/>
+              <w:left w:val="single" w:color="BBBBBB" w:sz="1"/>
+              <w:bottom w:val="single" w:color="BBBBBB" w:sz="1"/>
+              <w:right w:val="single" w:color="BBBBBB" w:sz="1"/>
+            </w:tcBorders>
+            <w:tcMar>
+              <w:top w:type="dxa" w:w="80"/>
+              <w:left w:type="dxa" w:w="120"/>
+              <w:bottom w:type="dxa" w:w="80"/>
+              <w:right w:type="dxa" w:w="120"/>
+            </w:tcMar>
+          </w:tcPr>
+          <w:p>
+            <w:pPr>
+              <w:jc w:val="left"/>
+            </w:pPr>
+            <w:r>
+              <w:rPr>
+                <w:sz w:val="20"/>
+                <w:szCs w:val="20"/>
+              </w:rPr>
+              <w:t xml:space="preserve">10</w:t>
+            </w:r>
+          </w:p>
+        </w:tc>
+        <w:tc>
+          <w:tcPr>
+            <w:tcW w:type="dxa" w:w="1600"/>
+            <w:tcBorders>
+              <w:top w:val="single" w:color="BBBBBB" w:sz="1"/>
+              <w:left w:val="single" w:color="BBBBBB" w:sz="1"/>
+              <w:bottom w:val="single" w:color="BBBBBB" w:sz="1"/>
+              <w:right w:val="single" w:color="BBBBBB" w:sz="1"/>
+            </w:tcBorders>
+            <w:tcMar>
+              <w:top w:type="dxa" w:w="80"/>
+              <w:left w:type="dxa" w:w="120"/>
+              <w:bottom w:type="dxa" w:w="80"/>
+              <w:right w:type="dxa" w:w="120"/>
+            </w:tcMar>
+          </w:tcPr>
+          <w:p>
+            <w:pPr>
+              <w:jc w:val="right"/>
+            </w:pPr>
+            <w:r>
+              <w:rPr>
+                <w:sz w:val="20"/>
+                <w:szCs w:val="20"/>
+              </w:rPr>
+              <w:t xml:space="preserve">1.0810</w:t>
+            </w:r>
+          </w:p>
+        </w:tc>
+        <w:tc>
+          <w:tcPr>
+            <w:tcW w:type="dxa" w:w="1700"/>
+            <w:tcBorders>
+              <w:top w:val="single" w:color="BBBBBB" w:sz="1"/>
+              <w:left w:val="single" w:color="BBBBBB" w:sz="1"/>
+              <w:bottom w:val="single" w:color="BBBBBB" w:sz="1"/>
+              <w:right w:val="single" w:color="BBBBBB" w:sz="1"/>
+            </w:tcBorders>
+            <w:tcMar>
+              <w:top w:type="dxa" w:w="80"/>
+              <w:left w:type="dxa" w:w="120"/>
+              <w:bottom w:type="dxa" w:w="80"/>
+              <w:right w:type="dxa" w:w="120"/>
+            </w:tcMar>
+          </w:tcPr>
+          <w:p>
+            <w:pPr>
+              <w:jc w:val="right"/>
+            </w:pPr>
+            <w:r>
+              <w:rPr>
+                <w:sz w:val="20"/>
+                <w:szCs w:val="20"/>
+              </w:rPr>
+              <w:t xml:space="preserve">-9.889</w:t>
+            </w:r>
+          </w:p>
+        </w:tc>
+        <w:tc>
+          <w:tcPr>
+            <w:tcW w:type="dxa" w:w="4826"/>
+            <w:tcBorders>
+              <w:top w:val="single" w:color="BBBBBB" w:sz="1"/>
+              <w:left w:val="single" w:color="BBBBBB" w:sz="1"/>
+              <w:bottom w:val="single" w:color="BBBBBB" w:sz="1"/>
+              <w:right w:val="single" w:color="BBBBBB" w:sz="1"/>
+            </w:tcBorders>
+            <w:tcMar>
+              <w:top w:type="dxa" w:w="80"/>
+              <w:left w:type="dxa" w:w="120"/>
+              <w:bottom w:type="dxa" w:w="80"/>
+              <w:right w:type="dxa" w:w="120"/>
+            </w:tcMar>
+          </w:tcPr>
+          <w:p>
+            <w:pPr>
+              <w:jc w:val="left"/>
+            </w:pPr>
+            <w:r>
+              <w:rPr>
+                <w:sz w:val="20"/>
+                <w:szCs w:val="20"/>
+              </w:rPr>
+              <w:t xml:space="preserve">(17.52, 9.05) → (24.93, 17.06)</w:t>
+            </w:r>
+          </w:p>
+        </w:tc>
+      </w:tr>
+      <w:tr>
+        <w:tc>
+          <w:tcPr>
+            <w:tcW w:type="dxa" w:w="900"/>
+            <w:tcBorders>
+              <w:top w:val="single" w:color="BBBBBB" w:sz="1"/>
+              <w:left w:val="single" w:color="BBBBBB" w:sz="1"/>
+              <w:bottom w:val="single" w:color="BBBBBB" w:sz="1"/>
+              <w:right w:val="single" w:color="BBBBBB" w:sz="1"/>
+            </w:tcBorders>
+            <w:tcMar>
+              <w:top w:type="dxa" w:w="80"/>
+              <w:left w:type="dxa" w:w="120"/>
+              <w:bottom w:type="dxa" w:w="80"/>
+              <w:right w:type="dxa" w:w="120"/>
+            </w:tcMar>
+          </w:tcPr>
+          <w:p>
+            <w:pPr>
+              <w:jc w:val="left"/>
+            </w:pPr>
+            <w:r>
+              <w:rPr>
+                <w:sz w:val="20"/>
+                <w:szCs w:val="20"/>
+              </w:rPr>
+              <w:t xml:space="preserve">12</w:t>
+            </w:r>
+          </w:p>
+        </w:tc>
+        <w:tc>
+          <w:tcPr>
+            <w:tcW w:type="dxa" w:w="1600"/>
+            <w:tcBorders>
+              <w:top w:val="single" w:color="BBBBBB" w:sz="1"/>
+              <w:left w:val="single" w:color="BBBBBB" w:sz="1"/>
+              <w:bottom w:val="single" w:color="BBBBBB" w:sz="1"/>
+              <w:right w:val="single" w:color="BBBBBB" w:sz="1"/>
+            </w:tcBorders>
+            <w:tcMar>
+              <w:top w:type="dxa" w:w="80"/>
+              <w:left w:type="dxa" w:w="120"/>
+              <w:bottom w:type="dxa" w:w="80"/>
+              <w:right w:type="dxa" w:w="120"/>
+            </w:tcMar>
+          </w:tcPr>
+          <w:p>
+            <w:pPr>
+              <w:jc w:val="right"/>
+            </w:pPr>
+            <w:r>
+              <w:rPr>
+                <w:sz w:val="20"/>
+                <w:szCs w:val="20"/>
+              </w:rPr>
+              <w:t xml:space="preserve">1.0872</w:t>
+            </w:r>
+          </w:p>
+        </w:tc>
+        <w:tc>
+          <w:tcPr>
+            <w:tcW w:type="dxa" w:w="1700"/>
+            <w:tcBorders>
+              <w:top w:val="single" w:color="BBBBBB" w:sz="1"/>
+              <w:left w:val="single" w:color="BBBBBB" w:sz="1"/>
+              <w:bottom w:val="single" w:color="BBBBBB" w:sz="1"/>
+              <w:right w:val="single" w:color="BBBBBB" w:sz="1"/>
+            </w:tcBorders>
+            <w:tcMar>
+              <w:top w:type="dxa" w:w="80"/>
+              <w:left w:type="dxa" w:w="120"/>
+              <w:bottom w:type="dxa" w:w="80"/>
+              <w:right w:type="dxa" w:w="120"/>
+            </w:tcMar>
+          </w:tcPr>
+          <w:p>
+            <w:pPr>
+              <w:jc w:val="right"/>
+            </w:pPr>
+            <w:r>
+              <w:rPr>
+                <w:sz w:val="20"/>
+                <w:szCs w:val="20"/>
+              </w:rPr>
+              <w:t xml:space="preserve">-10.574</w:t>
+            </w:r>
+          </w:p>
+        </w:tc>
+        <w:tc>
+          <w:tcPr>
+            <w:tcW w:type="dxa" w:w="4826"/>
+            <w:tcBorders>
+              <w:top w:val="single" w:color="BBBBBB" w:sz="1"/>
+              <w:left w:val="single" w:color="BBBBBB" w:sz="1"/>
+              <w:bottom w:val="single" w:color="BBBBBB" w:sz="1"/>
+              <w:right w:val="single" w:color="BBBBBB" w:sz="1"/>
+            </w:tcBorders>
+            <w:tcMar>
+              <w:top w:type="dxa" w:w="80"/>
+              <w:left w:type="dxa" w:w="120"/>
+              <w:bottom w:type="dxa" w:w="80"/>
+              <w:right w:type="dxa" w:w="120"/>
+            </w:tcMar>
+          </w:tcPr>
+          <w:p>
+            <w:pPr>
+              <w:jc w:val="left"/>
+            </w:pPr>
+            <w:r>
+              <w:rPr>
+                <w:sz w:val="20"/>
+                <w:szCs w:val="20"/>
+              </w:rPr>
+              <w:t xml:space="preserve">(18.05, 9.05) → (25.39, 17.03)</w:t>
+            </w:r>
+          </w:p>
+        </w:tc>
+      </w:tr>
+      <w:tr>
+        <w:tc>
+          <w:tcPr>
+            <w:tcW w:type="dxa" w:w="900"/>
+            <w:tcBorders>
+              <w:top w:val="single" w:color="BBBBBB" w:sz="1"/>
+              <w:left w:val="single" w:color="BBBBBB" w:sz="1"/>
+              <w:bottom w:val="single" w:color="BBBBBB" w:sz="1"/>
+              <w:right w:val="single" w:color="BBBBBB" w:sz="1"/>
+            </w:tcBorders>
+            <w:tcMar>
+              <w:top w:type="dxa" w:w="80"/>
+              <w:left w:type="dxa" w:w="120"/>
+              <w:bottom w:type="dxa" w:w="80"/>
+              <w:right w:type="dxa" w:w="120"/>
+            </w:tcMar>
+          </w:tcPr>
+          <w:p>
+            <w:pPr>
+              <w:jc w:val="left"/>
+            </w:pPr>
+            <w:r>
+              <w:rPr>
+                <w:sz w:val="20"/>
+                <w:szCs w:val="20"/>
+              </w:rPr>
+              <w:t xml:space="preserve">14</w:t>
+            </w:r>
+          </w:p>
+        </w:tc>
+        <w:tc>
+          <w:tcPr>
+            <w:tcW w:type="dxa" w:w="1600"/>
+            <w:tcBorders>
+              <w:top w:val="single" w:color="BBBBBB" w:sz="1"/>
+              <w:left w:val="single" w:color="BBBBBB" w:sz="1"/>
+              <w:bottom w:val="single" w:color="BBBBBB" w:sz="1"/>
+              <w:right w:val="single" w:color="BBBBBB" w:sz="1"/>
+            </w:tcBorders>
+            <w:tcMar>
+              <w:top w:type="dxa" w:w="80"/>
+              <w:left w:type="dxa" w:w="120"/>
+              <w:bottom w:type="dxa" w:w="80"/>
+              <w:right w:type="dxa" w:w="120"/>
+            </w:tcMar>
+          </w:tcPr>
+          <w:p>
+            <w:pPr>
+              <w:jc w:val="right"/>
+            </w:pPr>
+            <w:r>
+              <w:rPr>
+                <w:sz w:val="20"/>
+                <w:szCs w:val="20"/>
+              </w:rPr>
+              <w:t xml:space="preserve">1.0556</w:t>
+            </w:r>
+          </w:p>
+        </w:tc>
+        <w:tc>
+          <w:tcPr>
+            <w:tcW w:type="dxa" w:w="1700"/>
+            <w:tcBorders>
+              <w:top w:val="single" w:color="BBBBBB" w:sz="1"/>
+              <w:left w:val="single" w:color="BBBBBB" w:sz="1"/>
+              <w:bottom w:val="single" w:color="BBBBBB" w:sz="1"/>
+              <w:right w:val="single" w:color="BBBBBB" w:sz="1"/>
+            </w:tcBorders>
+            <w:tcMar>
+              <w:top w:type="dxa" w:w="80"/>
+              <w:left w:type="dxa" w:w="120"/>
+              <w:bottom w:type="dxa" w:w="80"/>
+              <w:right w:type="dxa" w:w="120"/>
+            </w:tcMar>
+          </w:tcPr>
+          <w:p>
+            <w:pPr>
+              <w:jc w:val="right"/>
+            </w:pPr>
+            <w:r>
+              <w:rPr>
+                <w:sz w:val="20"/>
+                <w:szCs w:val="20"/>
+              </w:rPr>
+              <w:t xml:space="preserve">-10.300</w:t>
+            </w:r>
+          </w:p>
+        </w:tc>
+        <w:tc>
+          <w:tcPr>
+            <w:tcW w:type="dxa" w:w="4826"/>
+            <w:tcBorders>
+              <w:top w:val="single" w:color="BBBBBB" w:sz="1"/>
+              <w:left w:val="single" w:color="BBBBBB" w:sz="1"/>
+              <w:bottom w:val="single" w:color="BBBBBB" w:sz="1"/>
+              <w:right w:val="single" w:color="BBBBBB" w:sz="1"/>
+            </w:tcBorders>
+            <w:tcMar>
+              <w:top w:type="dxa" w:w="80"/>
+              <w:left w:type="dxa" w:w="120"/>
+              <w:bottom w:type="dxa" w:w="80"/>
+              <w:right w:type="dxa" w:w="120"/>
+            </w:tcMar>
+          </w:tcPr>
+          <w:p>
+            <w:pPr>
+              <w:jc w:val="left"/>
+            </w:pPr>
+            <w:r>
+              <w:rPr>
+                <w:sz w:val="20"/>
+                <w:szCs w:val="20"/>
+              </w:rPr>
+              <w:t xml:space="preserve">(18.33, 9.05) → (25.88, 17.02)</w:t>
+            </w:r>
+          </w:p>
+        </w:tc>
+      </w:tr>
+      <w:tr>
+        <w:tc>
+          <w:tcPr>
+            <w:tcW w:type="dxa" w:w="900"/>
+            <w:tcBorders>
+              <w:top w:val="single" w:color="BBBBBB" w:sz="1"/>
+              <w:left w:val="single" w:color="BBBBBB" w:sz="1"/>
+              <w:bottom w:val="single" w:color="BBBBBB" w:sz="1"/>
+              <w:right w:val="single" w:color="BBBBBB" w:sz="1"/>
+            </w:tcBorders>
+            <w:tcMar>
+              <w:top w:type="dxa" w:w="80"/>
+              <w:left w:type="dxa" w:w="120"/>
+              <w:bottom w:type="dxa" w:w="80"/>
+              <w:right w:type="dxa" w:w="120"/>
+            </w:tcMar>
+          </w:tcPr>
+          <w:p>
+            <w:pPr>
+              <w:jc w:val="left"/>
+            </w:pPr>
+            <w:r>
+              <w:rPr>
+                <w:sz w:val="20"/>
+                <w:szCs w:val="20"/>
+              </w:rPr>
+              <w:t xml:space="preserve">16</w:t>
+            </w:r>
+          </w:p>
+        </w:tc>
+        <w:tc>
+          <w:tcPr>
+            <w:tcW w:type="dxa" w:w="1600"/>
+            <w:tcBorders>
+              <w:top w:val="single" w:color="BBBBBB" w:sz="1"/>
+              <w:left w:val="single" w:color="BBBBBB" w:sz="1"/>
+              <w:bottom w:val="single" w:color="BBBBBB" w:sz="1"/>
+              <w:right w:val="single" w:color="BBBBBB" w:sz="1"/>
+            </w:tcBorders>
+            <w:tcMar>
+              <w:top w:type="dxa" w:w="80"/>
+              <w:left w:type="dxa" w:w="120"/>
+              <w:bottom w:type="dxa" w:w="80"/>
+              <w:right w:type="dxa" w:w="120"/>
+            </w:tcMar>
+          </w:tcPr>
+          <w:p>
+            <w:pPr>
+              <w:jc w:val="right"/>
+            </w:pPr>
+            <w:r>
+              <w:rPr>
+                <w:sz w:val="20"/>
+                <w:szCs w:val="20"/>
+              </w:rPr>
+              <w:t xml:space="preserve">1.0431</w:t>
+            </w:r>
+          </w:p>
+        </w:tc>
+        <w:tc>
+          <w:tcPr>
+            <w:tcW w:type="dxa" w:w="1700"/>
+            <w:tcBorders>
+              <w:top w:val="single" w:color="BBBBBB" w:sz="1"/>
+              <w:left w:val="single" w:color="BBBBBB" w:sz="1"/>
+              <w:bottom w:val="single" w:color="BBBBBB" w:sz="1"/>
+              <w:right w:val="single" w:color="BBBBBB" w:sz="1"/>
+            </w:tcBorders>
+            <w:tcMar>
+              <w:top w:type="dxa" w:w="80"/>
+              <w:left w:type="dxa" w:w="120"/>
+              <w:bottom w:type="dxa" w:w="80"/>
+              <w:right w:type="dxa" w:w="120"/>
+            </w:tcMar>
+          </w:tcPr>
+          <w:p>
+            <w:pPr>
+              <w:jc w:val="right"/>
+            </w:pPr>
+            <w:r>
+              <w:rPr>
+                <w:sz w:val="20"/>
+                <w:szCs w:val="20"/>
+              </w:rPr>
+              <w:t xml:space="preserve">-10.414</w:t>
+            </w:r>
+          </w:p>
+        </w:tc>
+        <w:tc>
+          <w:tcPr>
+            <w:tcW w:type="dxa" w:w="4826"/>
+            <w:tcBorders>
+              <w:top w:val="single" w:color="BBBBBB" w:sz="1"/>
+              <w:left w:val="single" w:color="BBBBBB" w:sz="1"/>
+              <w:bottom w:val="single" w:color="BBBBBB" w:sz="1"/>
+              <w:right w:val="single" w:color="BBBBBB" w:sz="1"/>
+            </w:tcBorders>
+            <w:tcMar>
+              <w:top w:type="dxa" w:w="80"/>
+              <w:left w:type="dxa" w:w="120"/>
+              <w:bottom w:type="dxa" w:w="80"/>
+              <w:right w:type="dxa" w:w="120"/>
+            </w:tcMar>
+          </w:tcPr>
+          <w:p>
+            <w:pPr>
+              <w:jc w:val="left"/>
+            </w:pPr>
+            <w:r>
+              <w:rPr>
+                <w:sz w:val="20"/>
+                <w:szCs w:val="20"/>
+              </w:rPr>
+              <w:t xml:space="preserve">(18.66, 9.05) → (26.32, 17.04)</w:t>
+            </w:r>
+          </w:p>
+        </w:tc>
+      </w:tr>
+      <w:tr>
+        <w:tc>
+          <w:tcPr>
+            <w:tcW w:type="dxa" w:w="900"/>
+            <w:tcBorders>
+              <w:top w:val="single" w:color="BBBBBB" w:sz="1"/>
+              <w:left w:val="single" w:color="BBBBBB" w:sz="1"/>
+              <w:bottom w:val="single" w:color="BBBBBB" w:sz="1"/>
+              <w:right w:val="single" w:color="BBBBBB" w:sz="1"/>
+            </w:tcBorders>
+            <w:tcMar>
+              <w:top w:type="dxa" w:w="80"/>
+              <w:left w:type="dxa" w:w="120"/>
+              <w:bottom w:type="dxa" w:w="80"/>
+              <w:right w:type="dxa" w:w="120"/>
+            </w:tcMar>
+          </w:tcPr>
+          <w:p>
+            <w:pPr>
+              <w:jc w:val="left"/>
+            </w:pPr>
+            <w:r>
+              <w:rPr>
+                <w:sz w:val="20"/>
+                <w:szCs w:val="20"/>
+              </w:rPr>
+              <w:t xml:space="preserve">18</w:t>
+            </w:r>
+          </w:p>
+        </w:tc>
+        <w:tc>
+          <w:tcPr>
+            <w:tcW w:type="dxa" w:w="1600"/>
+            <w:tcBorders>
+              <w:top w:val="single" w:color="BBBBBB" w:sz="1"/>
+              <w:left w:val="single" w:color="BBBBBB" w:sz="1"/>
+              <w:bottom w:val="single" w:color="BBBBBB" w:sz="1"/>
+              <w:right w:val="single" w:color="BBBBBB" w:sz="1"/>
+            </w:tcBorders>
+            <w:tcMar>
+              <w:top w:type="dxa" w:w="80"/>
+              <w:left w:type="dxa" w:w="120"/>
+              <w:bottom w:type="dxa" w:w="80"/>
+              <w:right w:type="dxa" w:w="120"/>
+            </w:tcMar>
+          </w:tcPr>
+          <w:p>
+            <w:pPr>
+              <w:jc w:val="right"/>
+            </w:pPr>
+            <w:r>
+              <w:rPr>
+                <w:sz w:val="20"/>
+                <w:szCs w:val="20"/>
+              </w:rPr>
+              <w:t xml:space="preserve">1.0438</w:t>
+            </w:r>
+          </w:p>
+        </w:tc>
+        <w:tc>
+          <w:tcPr>
+            <w:tcW w:type="dxa" w:w="1700"/>
+            <w:tcBorders>
+              <w:top w:val="single" w:color="BBBBBB" w:sz="1"/>
+              <w:left w:val="single" w:color="BBBBBB" w:sz="1"/>
+              <w:bottom w:val="single" w:color="BBBBBB" w:sz="1"/>
+              <w:right w:val="single" w:color="BBBBBB" w:sz="1"/>
+            </w:tcBorders>
+            <w:tcMar>
+              <w:top w:type="dxa" w:w="80"/>
+              <w:left w:type="dxa" w:w="120"/>
+              <w:bottom w:type="dxa" w:w="80"/>
+              <w:right w:type="dxa" w:w="120"/>
+            </w:tcMar>
+          </w:tcPr>
+          <w:p>
+            <w:pPr>
+              <w:jc w:val="right"/>
+            </w:pPr>
+            <w:r>
+              <w:rPr>
+                <w:sz w:val="20"/>
+                <w:szCs w:val="20"/>
+              </w:rPr>
+              <w:t xml:space="preserve">-10.824</w:t>
+            </w:r>
+          </w:p>
+        </w:tc>
+        <w:tc>
+          <w:tcPr>
+            <w:tcW w:type="dxa" w:w="4826"/>
+            <w:tcBorders>
+              <w:top w:val="single" w:color="BBBBBB" w:sz="1"/>
+              <w:left w:val="single" w:color="BBBBBB" w:sz="1"/>
+              <w:bottom w:val="single" w:color="BBBBBB" w:sz="1"/>
+              <w:right w:val="single" w:color="BBBBBB" w:sz="1"/>
+            </w:tcBorders>
+            <w:tcMar>
+              <w:top w:type="dxa" w:w="80"/>
+              <w:left w:type="dxa" w:w="120"/>
+              <w:bottom w:type="dxa" w:w="80"/>
+              <w:right w:type="dxa" w:w="120"/>
+            </w:tcMar>
+          </w:tcPr>
+          <w:p>
+            <w:pPr>
+              <w:jc w:val="left"/>
+            </w:pPr>
+            <w:r>
+              <w:rPr>
+                <w:sz w:val="20"/>
+                <w:szCs w:val="20"/>
+              </w:rPr>
+              <w:t xml:space="preserve">(19.04, 9.05) → (26.57, 16.91)</w:t>
+            </w:r>
+          </w:p>
+        </w:tc>
+      </w:tr>
+      <w:tr>
+        <w:tc>
+          <w:tcPr>
+            <w:tcW w:type="dxa" w:w="900"/>
+            <w:tcBorders>
+              <w:top w:val="single" w:color="BBBBBB" w:sz="1"/>
+              <w:left w:val="single" w:color="BBBBBB" w:sz="1"/>
+              <w:bottom w:val="single" w:color="BBBBBB" w:sz="1"/>
+              <w:right w:val="single" w:color="BBBBBB" w:sz="1"/>
+            </w:tcBorders>
+            <w:tcMar>
+              <w:top w:type="dxa" w:w="80"/>
+              <w:left w:type="dxa" w:w="120"/>
+              <w:bottom w:type="dxa" w:w="80"/>
+              <w:right w:type="dxa" w:w="120"/>
+            </w:tcMar>
+          </w:tcPr>
+          <w:p>
+            <w:pPr>
+              <w:jc w:val="left"/>
+            </w:pPr>
+            <w:r>
+              <w:rPr>
+                <w:sz w:val="20"/>
+                <w:szCs w:val="20"/>
+              </w:rPr>
+              <w:t xml:space="preserve">20</w:t>
+            </w:r>
+          </w:p>
+        </w:tc>
+        <w:tc>
+          <w:tcPr>
+            <w:tcW w:type="dxa" w:w="1600"/>
+            <w:tcBorders>
+              <w:top w:val="single" w:color="BBBBBB" w:sz="1"/>
+              <w:left w:val="single" w:color="BBBBBB" w:sz="1"/>
+              <w:bottom w:val="single" w:color="BBBBBB" w:sz="1"/>
+              <w:right w:val="single" w:color="BBBBBB" w:sz="1"/>
+            </w:tcBorders>
+            <w:tcMar>
+              <w:top w:type="dxa" w:w="80"/>
+              <w:left w:type="dxa" w:w="120"/>
+              <w:bottom w:type="dxa" w:w="80"/>
+              <w:right w:type="dxa" w:w="120"/>
+            </w:tcMar>
+          </w:tcPr>
+          <w:p>
+            <w:pPr>
+              <w:jc w:val="right"/>
+            </w:pPr>
+            <w:r>
+              <w:rPr>
+                <w:sz w:val="20"/>
+                <w:szCs w:val="20"/>
+              </w:rPr>
+              <w:t xml:space="preserve">1.0462</w:t>
+            </w:r>
+          </w:p>
+        </w:tc>
+        <w:tc>
+          <w:tcPr>
+            <w:tcW w:type="dxa" w:w="1700"/>
+            <w:tcBorders>
+              <w:top w:val="single" w:color="BBBBBB" w:sz="1"/>
+              <w:left w:val="single" w:color="BBBBBB" w:sz="1"/>
+              <w:bottom w:val="single" w:color="BBBBBB" w:sz="1"/>
+              <w:right w:val="single" w:color="BBBBBB" w:sz="1"/>
+            </w:tcBorders>
+            <w:tcMar>
+              <w:top w:type="dxa" w:w="80"/>
+              <w:left w:type="dxa" w:w="120"/>
+              <w:bottom w:type="dxa" w:w="80"/>
+              <w:right w:type="dxa" w:w="120"/>
+            </w:tcMar>
+          </w:tcPr>
+          <w:p>
+            <w:pPr>
+              <w:jc w:val="right"/>
+            </w:pPr>
+            <w:r>
+              <w:rPr>
+                <w:sz w:val="20"/>
+                <w:szCs w:val="20"/>
+              </w:rPr>
+              <w:t xml:space="preserve">-11.267</w:t>
+            </w:r>
+          </w:p>
+        </w:tc>
+        <w:tc>
+          <w:tcPr>
+            <w:tcW w:type="dxa" w:w="4826"/>
+            <w:tcBorders>
+              <w:top w:val="single" w:color="BBBBBB" w:sz="1"/>
+              <w:left w:val="single" w:color="BBBBBB" w:sz="1"/>
+              <w:bottom w:val="single" w:color="BBBBBB" w:sz="1"/>
+              <w:right w:val="single" w:color="BBBBBB" w:sz="1"/>
+            </w:tcBorders>
+            <w:tcMar>
+              <w:top w:type="dxa" w:w="80"/>
+              <w:left w:type="dxa" w:w="120"/>
+              <w:bottom w:type="dxa" w:w="80"/>
+              <w:right w:type="dxa" w:w="120"/>
+            </w:tcMar>
+          </w:tcPr>
+          <w:p>
+            <w:pPr>
+              <w:jc w:val="left"/>
+            </w:pPr>
+            <w:r>
+              <w:rPr>
+                <w:sz w:val="20"/>
+                <w:szCs w:val="20"/>
+              </w:rPr>
+              <w:t xml:space="preserve">(19.42, 9.05) → (26.78, 16.75)</w:t>
+            </w:r>
+          </w:p>
+        </w:tc>
+      </w:tr>
+      <w:tr>
+        <w:tc>
+          <w:tcPr>
+            <w:tcW w:type="dxa" w:w="900"/>
+            <w:tcBorders>
+              <w:top w:val="single" w:color="BBBBBB" w:sz="1"/>
+              <w:left w:val="single" w:color="BBBBBB" w:sz="1"/>
+              <w:bottom w:val="single" w:color="BBBBBB" w:sz="1"/>
+              <w:right w:val="single" w:color="BBBBBB" w:sz="1"/>
+            </w:tcBorders>
+            <w:tcMar>
+              <w:top w:type="dxa" w:w="80"/>
+              <w:left w:type="dxa" w:w="120"/>
+              <w:bottom w:type="dxa" w:w="80"/>
+              <w:right w:type="dxa" w:w="120"/>
+            </w:tcMar>
+          </w:tcPr>
+          <w:p>
+            <w:pPr>
+              <w:jc w:val="left"/>
+            </w:pPr>
+            <w:r>
+              <w:rPr>
+                <w:sz w:val="20"/>
+                <w:szCs w:val="20"/>
+              </w:rPr>
+              <w:t xml:space="preserve">22</w:t>
+            </w:r>
+          </w:p>
+        </w:tc>
+        <w:tc>
+          <w:tcPr>
+            <w:tcW w:type="dxa" w:w="1600"/>
+            <w:tcBorders>
+              <w:top w:val="single" w:color="BBBBBB" w:sz="1"/>
+              <w:left w:val="single" w:color="BBBBBB" w:sz="1"/>
+              <w:bottom w:val="single" w:color="BBBBBB" w:sz="1"/>
+              <w:right w:val="single" w:color="BBBBBB" w:sz="1"/>
+            </w:tcBorders>
+            <w:tcMar>
+              <w:top w:type="dxa" w:w="80"/>
+              <w:left w:type="dxa" w:w="120"/>
+              <w:bottom w:type="dxa" w:w="80"/>
+              <w:right w:type="dxa" w:w="120"/>
+            </w:tcMar>
+          </w:tcPr>
+          <w:p>
+            <w:pPr>
+              <w:jc w:val="right"/>
+            </w:pPr>
+            <w:r>
+              <w:rPr>
+                <w:sz w:val="20"/>
+                <w:szCs w:val="20"/>
+              </w:rPr>
+              <w:t xml:space="preserve">1.0301</w:t>
+            </w:r>
+          </w:p>
+        </w:tc>
+        <w:tc>
+          <w:tcPr>
+            <w:tcW w:type="dxa" w:w="1700"/>
+            <w:tcBorders>
+              <w:top w:val="single" w:color="BBBBBB" w:sz="1"/>
+              <w:left w:val="single" w:color="BBBBBB" w:sz="1"/>
+              <w:bottom w:val="single" w:color="BBBBBB" w:sz="1"/>
+              <w:right w:val="single" w:color="BBBBBB" w:sz="1"/>
+            </w:tcBorders>
+            <w:tcMar>
+              <w:top w:type="dxa" w:w="80"/>
+              <w:left w:type="dxa" w:w="120"/>
+              <w:bottom w:type="dxa" w:w="80"/>
+              <w:right w:type="dxa" w:w="120"/>
+            </w:tcMar>
+          </w:tcPr>
+          <w:p>
+            <w:pPr>
+              <w:jc w:val="right"/>
+            </w:pPr>
+            <w:r>
+              <w:rPr>
+                <w:sz w:val="20"/>
+                <w:szCs w:val="20"/>
+              </w:rPr>
+              <w:t xml:space="preserve">-11.294</w:t>
+            </w:r>
+          </w:p>
+        </w:tc>
+        <w:tc>
+          <w:tcPr>
+            <w:tcW w:type="dxa" w:w="4826"/>
+            <w:tcBorders>
+              <w:top w:val="single" w:color="BBBBBB" w:sz="1"/>
+              <w:left w:val="single" w:color="BBBBBB" w:sz="1"/>
+              <w:bottom w:val="single" w:color="BBBBBB" w:sz="1"/>
+              <w:right w:val="single" w:color="BBBBBB" w:sz="1"/>
+            </w:tcBorders>
+            <w:tcMar>
+              <w:top w:type="dxa" w:w="80"/>
+              <w:left w:type="dxa" w:w="120"/>
+              <w:bottom w:type="dxa" w:w="80"/>
+              <w:right w:type="dxa" w:w="120"/>
+            </w:tcMar>
+          </w:tcPr>
+          <w:p>
+            <w:pPr>
+              <w:jc w:val="left"/>
+            </w:pPr>
+            <w:r>
+              <w:rPr>
+                <w:sz w:val="20"/>
+                <w:szCs w:val="20"/>
+              </w:rPr>
+              <w:t xml:space="preserve">(19.75, 9.05) → (27.07, 16.59)</w:t>
+            </w:r>
+          </w:p>
+        </w:tc>
+      </w:tr>
+      <w:tr>
+        <w:tc>
+          <w:tcPr>
+            <w:tcW w:type="dxa" w:w="900"/>
+            <w:tcBorders>
+              <w:top w:val="single" w:color="BBBBBB" w:sz="1"/>
+              <w:left w:val="single" w:color="BBBBBB" w:sz="1"/>
+              <w:bottom w:val="single" w:color="BBBBBB" w:sz="1"/>
+              <w:right w:val="single" w:color="BBBBBB" w:sz="1"/>
+            </w:tcBorders>
+            <w:tcMar>
+              <w:top w:type="dxa" w:w="80"/>
+              <w:left w:type="dxa" w:w="120"/>
+              <w:bottom w:type="dxa" w:w="80"/>
+              <w:right w:type="dxa" w:w="120"/>
+            </w:tcMar>
+          </w:tcPr>
+          <w:p>
+            <w:pPr>
+              <w:jc w:val="left"/>
+            </w:pPr>
+            <w:r>
+              <w:rPr>
+                <w:sz w:val="20"/>
+                <w:szCs w:val="20"/>
+              </w:rPr>
+              <w:t xml:space="preserve">24</w:t>
+            </w:r>
+          </w:p>
+        </w:tc>
+        <w:tc>
+          <w:tcPr>
+            <w:tcW w:type="dxa" w:w="1600"/>
+            <w:tcBorders>
+              <w:top w:val="single" w:color="BBBBBB" w:sz="1"/>
+              <w:left w:val="single" w:color="BBBBBB" w:sz="1"/>
+              <w:bottom w:val="single" w:color="BBBBBB" w:sz="1"/>
+              <w:right w:val="single" w:color="BBBBBB" w:sz="1"/>
+            </w:tcBorders>
+            <w:tcMar>
+              <w:top w:type="dxa" w:w="80"/>
+              <w:left w:type="dxa" w:w="120"/>
+              <w:bottom w:type="dxa" w:w="80"/>
+              <w:right w:type="dxa" w:w="120"/>
+            </w:tcMar>
+          </w:tcPr>
+          <w:p>
+            <w:pPr>
+              <w:jc w:val="right"/>
+            </w:pPr>
+            <w:r>
+              <w:rPr>
+                <w:sz w:val="20"/>
+                <w:szCs w:val="20"/>
+              </w:rPr>
+              <w:t xml:space="preserve">1.0124</w:t>
+            </w:r>
+          </w:p>
+        </w:tc>
+        <w:tc>
+          <w:tcPr>
+            <w:tcW w:type="dxa" w:w="1700"/>
+            <w:tcBorders>
+              <w:top w:val="single" w:color="BBBBBB" w:sz="1"/>
+              <w:left w:val="single" w:color="BBBBBB" w:sz="1"/>
+              <w:bottom w:val="single" w:color="BBBBBB" w:sz="1"/>
+              <w:right w:val="single" w:color="BBBBBB" w:sz="1"/>
+            </w:tcBorders>
+            <w:tcMar>
+              <w:top w:type="dxa" w:w="80"/>
+              <w:left w:type="dxa" w:w="120"/>
+              <w:bottom w:type="dxa" w:w="80"/>
+              <w:right w:type="dxa" w:w="120"/>
+            </w:tcMar>
+          </w:tcPr>
+          <w:p>
+            <w:pPr>
+              <w:jc w:val="right"/>
+            </w:pPr>
+            <w:r>
+              <w:rPr>
+                <w:sz w:val="20"/>
+                <w:szCs w:val="20"/>
+              </w:rPr>
+              <w:t xml:space="preserve">-11.270</w:t>
+            </w:r>
+          </w:p>
+        </w:tc>
+        <w:tc>
+          <w:tcPr>
+            <w:tcW w:type="dxa" w:w="4826"/>
+            <w:tcBorders>
+              <w:top w:val="single" w:color="BBBBBB" w:sz="1"/>
+              <w:left w:val="single" w:color="BBBBBB" w:sz="1"/>
+              <w:bottom w:val="single" w:color="BBBBBB" w:sz="1"/>
+              <w:right w:val="single" w:color="BBBBBB" w:sz="1"/>
+            </w:tcBorders>
+            <w:tcMar>
+              <w:top w:type="dxa" w:w="80"/>
+              <w:left w:type="dxa" w:w="120"/>
+              <w:bottom w:type="dxa" w:w="80"/>
+              <w:right w:type="dxa" w:w="120"/>
+            </w:tcMar>
+          </w:tcPr>
+          <w:p>
+            <w:pPr>
+              <w:jc w:val="left"/>
+            </w:pPr>
+            <w:r>
+              <w:rPr>
+                <w:sz w:val="20"/>
+                <w:szCs w:val="20"/>
+              </w:rPr>
+              <w:t xml:space="preserve">(20.07, 9.05) → (27.30, 16.37)</w:t>
+            </w:r>
+          </w:p>
+        </w:tc>
+      </w:tr>
+      <w:tr>
+        <w:tc>
+          <w:tcPr>
+            <w:tcW w:type="dxa" w:w="900"/>
+            <w:tcBorders>
+              <w:top w:val="single" w:color="BBBBBB" w:sz="1"/>
+              <w:left w:val="single" w:color="BBBBBB" w:sz="1"/>
+              <w:bottom w:val="single" w:color="BBBBBB" w:sz="1"/>
+              <w:right w:val="single" w:color="BBBBBB" w:sz="1"/>
+            </w:tcBorders>
+            <w:tcMar>
+              <w:top w:type="dxa" w:w="80"/>
+              <w:left w:type="dxa" w:w="120"/>
+              <w:bottom w:type="dxa" w:w="80"/>
+              <w:right w:type="dxa" w:w="120"/>
+            </w:tcMar>
+          </w:tcPr>
+          <w:p>
+            <w:pPr>
+              <w:jc w:val="left"/>
+            </w:pPr>
+            <w:r>
+              <w:rPr>
+                <w:sz w:val="20"/>
+                <w:szCs w:val="20"/>
+              </w:rPr>
+              <w:t xml:space="preserve">26</w:t>
+            </w:r>
+          </w:p>
+        </w:tc>
+        <w:tc>
+          <w:tcPr>
+            <w:tcW w:type="dxa" w:w="1600"/>
+            <w:tcBorders>
+              <w:top w:val="single" w:color="BBBBBB" w:sz="1"/>
+              <w:left w:val="single" w:color="BBBBBB" w:sz="1"/>
+              <w:bottom w:val="single" w:color="BBBBBB" w:sz="1"/>
+              <w:right w:val="single" w:color="BBBBBB" w:sz="1"/>
+            </w:tcBorders>
+            <w:tcMar>
+              <w:top w:type="dxa" w:w="80"/>
+              <w:left w:type="dxa" w:w="120"/>
+              <w:bottom w:type="dxa" w:w="80"/>
+              <w:right w:type="dxa" w:w="120"/>
+            </w:tcMar>
+          </w:tcPr>
+          <w:p>
+            <w:pPr>
+              <w:jc w:val="right"/>
+            </w:pPr>
+            <w:r>
+              <w:rPr>
+                <w:sz w:val="20"/>
+                <w:szCs w:val="20"/>
+              </w:rPr>
+              <w:t xml:space="preserve">0.9972</w:t>
+            </w:r>
+          </w:p>
+        </w:tc>
+        <w:tc>
+          <w:tcPr>
+            <w:tcW w:type="dxa" w:w="1700"/>
+            <w:tcBorders>
+              <w:top w:val="single" w:color="BBBBBB" w:sz="1"/>
+              <w:left w:val="single" w:color="BBBBBB" w:sz="1"/>
+              <w:bottom w:val="single" w:color="BBBBBB" w:sz="1"/>
+              <w:right w:val="single" w:color="BBBBBB" w:sz="1"/>
+            </w:tcBorders>
+            <w:tcMar>
+              <w:top w:type="dxa" w:w="80"/>
+              <w:left w:type="dxa" w:w="120"/>
+              <w:bottom w:type="dxa" w:w="80"/>
+              <w:right w:type="dxa" w:w="120"/>
+            </w:tcMar>
+          </w:tcPr>
+          <w:p>
+            <w:pPr>
+              <w:jc w:val="right"/>
+            </w:pPr>
+            <w:r>
+              <w:rPr>
+                <w:sz w:val="20"/>
+                <w:szCs w:val="20"/>
+              </w:rPr>
+              <w:t xml:space="preserve">-11.213</w:t>
+            </w:r>
+          </w:p>
+        </w:tc>
+        <w:tc>
+          <w:tcPr>
+            <w:tcW w:type="dxa" w:w="4826"/>
+            <w:tcBorders>
+              <w:top w:val="single" w:color="BBBBBB" w:sz="1"/>
+              <w:left w:val="single" w:color="BBBBBB" w:sz="1"/>
+              <w:bottom w:val="single" w:color="BBBBBB" w:sz="1"/>
+              <w:right w:val="single" w:color="BBBBBB" w:sz="1"/>
+            </w:tcBorders>
+            <w:tcMar>
+              <w:top w:type="dxa" w:w="80"/>
+              <w:left w:type="dxa" w:w="120"/>
+              <w:bottom w:type="dxa" w:w="80"/>
+              <w:right w:type="dxa" w:w="120"/>
+            </w:tcMar>
+          </w:tcPr>
+          <w:p>
+            <w:pPr>
+              <w:jc w:val="left"/>
+            </w:pPr>
+            <w:r>
+              <w:rPr>
+                <w:sz w:val="20"/>
+                <w:szCs w:val="20"/>
+              </w:rPr>
+              <w:t xml:space="preserve">(20.32, 9.05) → (27.48, 16.19)</w:t>
+            </w:r>
+          </w:p>
+        </w:tc>
+      </w:tr>
+      <w:tr>
+        <w:tc>
+          <w:tcPr>
+            <w:tcW w:type="dxa" w:w="900"/>
+            <w:tcBorders>
+              <w:top w:val="single" w:color="BBBBBB" w:sz="1"/>
+              <w:left w:val="single" w:color="BBBBBB" w:sz="1"/>
+              <w:bottom w:val="single" w:color="BBBBBB" w:sz="1"/>
+              <w:right w:val="single" w:color="BBBBBB" w:sz="1"/>
+            </w:tcBorders>
+            <w:tcMar>
+              <w:top w:type="dxa" w:w="80"/>
+              <w:left w:type="dxa" w:w="120"/>
+              <w:bottom w:type="dxa" w:w="80"/>
+              <w:right w:type="dxa" w:w="120"/>
+            </w:tcMar>
+          </w:tcPr>
+          <w:p>
+            <w:pPr>
+              <w:jc w:val="left"/>
+            </w:pPr>
+            <w:r>
+              <w:rPr>
+                <w:sz w:val="20"/>
+                <w:szCs w:val="20"/>
+              </w:rPr>
+              <w:t xml:space="preserve">28</w:t>
+            </w:r>
+          </w:p>
+        </w:tc>
+        <w:tc>
+          <w:tcPr>
+            <w:tcW w:type="dxa" w:w="1600"/>
+            <w:tcBorders>
+              <w:top w:val="single" w:color="BBBBBB" w:sz="1"/>
+              <w:left w:val="single" w:color="BBBBBB" w:sz="1"/>
+              <w:bottom w:val="single" w:color="BBBBBB" w:sz="1"/>
+              <w:right w:val="single" w:color="BBBBBB" w:sz="1"/>
+            </w:tcBorders>
+            <w:tcMar>
+              <w:top w:type="dxa" w:w="80"/>
+              <w:left w:type="dxa" w:w="120"/>
+              <w:bottom w:type="dxa" w:w="80"/>
+              <w:right w:type="dxa" w:w="120"/>
+            </w:tcMar>
+          </w:tcPr>
+          <w:p>
+            <w:pPr>
+              <w:jc w:val="right"/>
+            </w:pPr>
+            <w:r>
+              <w:rPr>
+                <w:sz w:val="20"/>
+                <w:szCs w:val="20"/>
+              </w:rPr>
+              <w:t xml:space="preserve">0.9721</w:t>
+            </w:r>
+          </w:p>
+        </w:tc>
+        <w:tc>
+          <w:tcPr>
+            <w:tcW w:type="dxa" w:w="1700"/>
+            <w:tcBorders>
+              <w:top w:val="single" w:color="BBBBBB" w:sz="1"/>
+              <w:left w:val="single" w:color="BBBBBB" w:sz="1"/>
+              <w:bottom w:val="single" w:color="BBBBBB" w:sz="1"/>
+              <w:right w:val="single" w:color="BBBBBB" w:sz="1"/>
+            </w:tcBorders>
+            <w:tcMar>
+              <w:top w:type="dxa" w:w="80"/>
+              <w:left w:type="dxa" w:w="120"/>
+              <w:bottom w:type="dxa" w:w="80"/>
+              <w:right w:type="dxa" w:w="120"/>
+            </w:tcMar>
+          </w:tcPr>
+          <w:p>
+            <w:pPr>
+              <w:jc w:val="right"/>
+            </w:pPr>
+            <w:r>
+              <w:rPr>
+                <w:sz w:val="20"/>
+                <w:szCs w:val="20"/>
+              </w:rPr>
+              <w:t xml:space="preserve">-10.955</w:t>
+            </w:r>
+          </w:p>
+        </w:tc>
+        <w:tc>
+          <w:tcPr>
+            <w:tcW w:type="dxa" w:w="4826"/>
+            <w:tcBorders>
+              <w:top w:val="single" w:color="BBBBBB" w:sz="1"/>
+              <w:left w:val="single" w:color="BBBBBB" w:sz="1"/>
+              <w:bottom w:val="single" w:color="BBBBBB" w:sz="1"/>
+              <w:right w:val="single" w:color="BBBBBB" w:sz="1"/>
+            </w:tcBorders>
+            <w:tcMar>
+              <w:top w:type="dxa" w:w="80"/>
+              <w:left w:type="dxa" w:w="120"/>
+              <w:bottom w:type="dxa" w:w="80"/>
+              <w:right w:type="dxa" w:w="120"/>
+            </w:tcMar>
+          </w:tcPr>
+          <w:p>
+            <w:pPr>
+              <w:jc w:val="left"/>
+            </w:pPr>
+            <w:r>
+              <w:rPr>
+                <w:sz w:val="20"/>
+                <w:szCs w:val="20"/>
+              </w:rPr>
+              <w:t xml:space="preserve">(20.58, 9.05) → (27.74, 16.01)</w:t>
+            </w:r>
+          </w:p>
+        </w:tc>
+      </w:tr>
+      <w:tr>
+        <w:tc>
+          <w:tcPr>
+            <w:tcW w:type="dxa" w:w="900"/>
+            <w:tcBorders>
+              <w:top w:val="single" w:color="BBBBBB" w:sz="1"/>
+              <w:left w:val="single" w:color="BBBBBB" w:sz="1"/>
+              <w:bottom w:val="single" w:color="BBBBBB" w:sz="1"/>
+              <w:right w:val="single" w:color="BBBBBB" w:sz="1"/>
+            </w:tcBorders>
+            <w:tcMar>
+              <w:top w:type="dxa" w:w="80"/>
+              <w:left w:type="dxa" w:w="120"/>
+              <w:bottom w:type="dxa" w:w="80"/>
+              <w:right w:type="dxa" w:w="120"/>
+            </w:tcMar>
+          </w:tcPr>
+          <w:p>
+            <w:pPr>
+              <w:jc w:val="left"/>
+            </w:pPr>
+            <w:r>
+              <w:rPr>
+                <w:sz w:val="20"/>
+                <w:szCs w:val="20"/>
+              </w:rPr>
+              <w:t xml:space="preserve">30</w:t>
+            </w:r>
+          </w:p>
+        </w:tc>
+        <w:tc>
+          <w:tcPr>
+            <w:tcW w:type="dxa" w:w="1600"/>
+            <w:tcBorders>
+              <w:top w:val="single" w:color="BBBBBB" w:sz="1"/>
+              <w:left w:val="single" w:color="BBBBBB" w:sz="1"/>
+              <w:bottom w:val="single" w:color="BBBBBB" w:sz="1"/>
+              <w:right w:val="single" w:color="BBBBBB" w:sz="1"/>
+            </w:tcBorders>
+            <w:tcMar>
+              <w:top w:type="dxa" w:w="80"/>
+              <w:left w:type="dxa" w:w="120"/>
+              <w:bottom w:type="dxa" w:w="80"/>
+              <w:right w:type="dxa" w:w="120"/>
+            </w:tcMar>
+          </w:tcPr>
+          <w:p>
+            <w:pPr>
+              <w:jc w:val="right"/>
+            </w:pPr>
+            <w:r>
+              <w:rPr>
+                <w:sz w:val="20"/>
+                <w:szCs w:val="20"/>
+              </w:rPr>
+              <w:t xml:space="preserve">0.9729</w:t>
+            </w:r>
+          </w:p>
+        </w:tc>
+        <w:tc>
+          <w:tcPr>
+            <w:tcW w:type="dxa" w:w="1700"/>
+            <w:tcBorders>
+              <w:top w:val="single" w:color="BBBBBB" w:sz="1"/>
+              <w:left w:val="single" w:color="BBBBBB" w:sz="1"/>
+              <w:bottom w:val="single" w:color="BBBBBB" w:sz="1"/>
+              <w:right w:val="single" w:color="BBBBBB" w:sz="1"/>
+            </w:tcBorders>
+            <w:tcMar>
+              <w:top w:type="dxa" w:w="80"/>
+              <w:left w:type="dxa" w:w="120"/>
+              <w:bottom w:type="dxa" w:w="80"/>
+              <w:right w:type="dxa" w:w="120"/>
+            </w:tcMar>
+          </w:tcPr>
+          <w:p>
+            <w:pPr>
+              <w:jc w:val="right"/>
+            </w:pPr>
+            <w:r>
+              <w:rPr>
+                <w:sz w:val="20"/>
+                <w:szCs w:val="20"/>
+              </w:rPr>
+              <w:t xml:space="preserve">-11.236</w:t>
+            </w:r>
+          </w:p>
+        </w:tc>
+        <w:tc>
+          <w:tcPr>
+            <w:tcW w:type="dxa" w:w="4826"/>
+            <w:tcBorders>
+              <w:top w:val="single" w:color="BBBBBB" w:sz="1"/>
+              <w:left w:val="single" w:color="BBBBBB" w:sz="1"/>
+              <w:bottom w:val="single" w:color="BBBBBB" w:sz="1"/>
+              <w:right w:val="single" w:color="BBBBBB" w:sz="1"/>
+            </w:tcBorders>
+            <w:tcMar>
+              <w:top w:type="dxa" w:w="80"/>
+              <w:left w:type="dxa" w:w="120"/>
+              <w:bottom w:type="dxa" w:w="80"/>
+              <w:right w:type="dxa" w:w="120"/>
+            </w:tcMar>
+          </w:tcPr>
+          <w:p>
+            <w:pPr>
+              <w:jc w:val="left"/>
+            </w:pPr>
+            <w:r>
+              <w:rPr>
+                <w:sz w:val="20"/>
+                <w:szCs w:val="20"/>
+              </w:rPr>
+              <w:t xml:space="preserve">(20.85, 9.05) → (27.87, 15.88)</w:t>
+            </w:r>
+          </w:p>
+        </w:tc>
+      </w:tr>
+      <w:tr>
+        <w:tc>
+          <w:tcPr>
+            <w:tcW w:type="dxa" w:w="900"/>
+            <w:tcBorders>
+              <w:top w:val="single" w:color="BBBBBB" w:sz="1"/>
+              <w:left w:val="single" w:color="BBBBBB" w:sz="1"/>
+              <w:bottom w:val="single" w:color="BBBBBB" w:sz="1"/>
+              <w:right w:val="single" w:color="BBBBBB" w:sz="1"/>
+            </w:tcBorders>
+            <w:tcMar>
+              <w:top w:type="dxa" w:w="80"/>
+              <w:left w:type="dxa" w:w="120"/>
+              <w:bottom w:type="dxa" w:w="80"/>
+              <w:right w:type="dxa" w:w="120"/>
+            </w:tcMar>
+          </w:tcPr>
+          <w:p>
+            <w:pPr>
+              <w:jc w:val="left"/>
+            </w:pPr>
+            <w:r>
+              <w:rPr>
+                <w:sz w:val="20"/>
+                <w:szCs w:val="20"/>
+              </w:rPr>
+              <w:t xml:space="preserve">35</w:t>
+            </w:r>
+          </w:p>
+        </w:tc>
+        <w:tc>
+          <w:tcPr>
+            <w:tcW w:type="dxa" w:w="1600"/>
+            <w:tcBorders>
+              <w:top w:val="single" w:color="BBBBBB" w:sz="1"/>
+              <w:left w:val="single" w:color="BBBBBB" w:sz="1"/>
+              <w:bottom w:val="single" w:color="BBBBBB" w:sz="1"/>
+              <w:right w:val="single" w:color="BBBBBB" w:sz="1"/>
+            </w:tcBorders>
+            <w:tcMar>
+              <w:top w:type="dxa" w:w="80"/>
+              <w:left w:type="dxa" w:w="120"/>
+              <w:bottom w:type="dxa" w:w="80"/>
+              <w:right w:type="dxa" w:w="120"/>
+            </w:tcMar>
+          </w:tcPr>
+          <w:p>
+            <w:pPr>
+              <w:jc w:val="right"/>
+            </w:pPr>
+            <w:r>
+              <w:rPr>
+                <w:sz w:val="20"/>
+                <w:szCs w:val="20"/>
+              </w:rPr>
+              <w:t xml:space="preserve">0.9515</w:t>
+            </w:r>
+          </w:p>
+        </w:tc>
+        <w:tc>
+          <w:tcPr>
+            <w:tcW w:type="dxa" w:w="1700"/>
+            <w:tcBorders>
+              <w:top w:val="single" w:color="BBBBBB" w:sz="1"/>
+              <w:left w:val="single" w:color="BBBBBB" w:sz="1"/>
+              <w:bottom w:val="single" w:color="BBBBBB" w:sz="1"/>
+              <w:right w:val="single" w:color="BBBBBB" w:sz="1"/>
+            </w:tcBorders>
+            <w:tcMar>
+              <w:top w:type="dxa" w:w="80"/>
+              <w:left w:type="dxa" w:w="120"/>
+              <w:bottom w:type="dxa" w:w="80"/>
+              <w:right w:type="dxa" w:w="120"/>
+            </w:tcMar>
+          </w:tcPr>
+          <w:p>
+            <w:pPr>
+              <w:jc w:val="right"/>
+            </w:pPr>
+            <w:r>
+              <w:rPr>
+                <w:sz w:val="20"/>
+                <w:szCs w:val="20"/>
+              </w:rPr>
+              <w:t xml:space="preserve">-11.112</w:t>
+            </w:r>
+          </w:p>
+        </w:tc>
+        <w:tc>
+          <w:tcPr>
+            <w:tcW w:type="dxa" w:w="4826"/>
+            <w:tcBorders>
+              <w:top w:val="single" w:color="BBBBBB" w:sz="1"/>
+              <w:left w:val="single" w:color="BBBBBB" w:sz="1"/>
+              <w:bottom w:val="single" w:color="BBBBBB" w:sz="1"/>
+              <w:right w:val="single" w:color="BBBBBB" w:sz="1"/>
+            </w:tcBorders>
+            <w:tcMar>
+              <w:top w:type="dxa" w:w="80"/>
+              <w:left w:type="dxa" w:w="120"/>
+              <w:bottom w:type="dxa" w:w="80"/>
+              <w:right w:type="dxa" w:w="120"/>
+            </w:tcMar>
+          </w:tcPr>
+          <w:p>
+            <w:pPr>
+              <w:jc w:val="left"/>
+            </w:pPr>
+            <w:r>
+              <w:rPr>
+                <w:sz w:val="20"/>
+                <w:szCs w:val="20"/>
+              </w:rPr>
+              <w:t xml:space="preserve">(21.19, 9.05) → (28.20, 15.72)</w:t>
+            </w:r>
+          </w:p>
+        </w:tc>
+      </w:tr>
+      <w:tr>
+        <w:tc>
+          <w:tcPr>
+            <w:tcW w:type="dxa" w:w="900"/>
+            <w:tcBorders>
+              <w:top w:val="single" w:color="BBBBBB" w:sz="1"/>
+              <w:left w:val="single" w:color="BBBBBB" w:sz="1"/>
+              <w:bottom w:val="single" w:color="BBBBBB" w:sz="1"/>
+              <w:right w:val="single" w:color="BBBBBB" w:sz="1"/>
+            </w:tcBorders>
+            <w:tcMar>
+              <w:top w:type="dxa" w:w="80"/>
+              <w:left w:type="dxa" w:w="120"/>
+              <w:bottom w:type="dxa" w:w="80"/>
+              <w:right w:type="dxa" w:w="120"/>
+            </w:tcMar>
+          </w:tcPr>
+          <w:p>
+            <w:pPr>
+              <w:jc w:val="left"/>
+            </w:pPr>
+            <w:r>
+              <w:rPr>
+                <w:sz w:val="20"/>
+                <w:szCs w:val="20"/>
+              </w:rPr>
+              <w:t xml:space="preserve">40</w:t>
+            </w:r>
+          </w:p>
+        </w:tc>
+        <w:tc>
+          <w:tcPr>
+            <w:tcW w:type="dxa" w:w="1600"/>
+            <w:tcBorders>
+              <w:top w:val="single" w:color="BBBBBB" w:sz="1"/>
+              <w:left w:val="single" w:color="BBBBBB" w:sz="1"/>
+              <w:bottom w:val="single" w:color="BBBBBB" w:sz="1"/>
+              <w:right w:val="single" w:color="BBBBBB" w:sz="1"/>
+            </w:tcBorders>
+            <w:tcMar>
+              <w:top w:type="dxa" w:w="80"/>
+              <w:left w:type="dxa" w:w="120"/>
+              <w:bottom w:type="dxa" w:w="80"/>
+              <w:right w:type="dxa" w:w="120"/>
+            </w:tcMar>
+          </w:tcPr>
+          <w:p>
+            <w:pPr>
+              <w:jc w:val="right"/>
+            </w:pPr>
+            <w:r>
+              <w:rPr>
+                <w:sz w:val="20"/>
+                <w:szCs w:val="20"/>
+              </w:rPr>
+              <w:t xml:space="preserve">0.9044</w:t>
+            </w:r>
+          </w:p>
+        </w:tc>
+        <w:tc>
+          <w:tcPr>
+            <w:tcW w:type="dxa" w:w="1700"/>
+            <w:tcBorders>
+              <w:top w:val="single" w:color="BBBBBB" w:sz="1"/>
+              <w:left w:val="single" w:color="BBBBBB" w:sz="1"/>
+              <w:bottom w:val="single" w:color="BBBBBB" w:sz="1"/>
+              <w:right w:val="single" w:color="BBBBBB" w:sz="1"/>
+            </w:tcBorders>
+            <w:tcMar>
+              <w:top w:type="dxa" w:w="80"/>
+              <w:left w:type="dxa" w:w="120"/>
+              <w:bottom w:type="dxa" w:w="80"/>
+              <w:right w:type="dxa" w:w="120"/>
+            </w:tcMar>
+          </w:tcPr>
+          <w:p>
+            <w:pPr>
+              <w:jc w:val="right"/>
+            </w:pPr>
+            <w:r>
+              <w:rPr>
+                <w:sz w:val="20"/>
+                <w:szCs w:val="20"/>
+              </w:rPr>
+              <w:t xml:space="preserve">-10.323</w:t>
+            </w:r>
+          </w:p>
+        </w:tc>
+        <w:tc>
+          <w:tcPr>
+            <w:tcW w:type="dxa" w:w="4826"/>
+            <w:tcBorders>
+              <w:top w:val="single" w:color="BBBBBB" w:sz="1"/>
+              <w:left w:val="single" w:color="BBBBBB" w:sz="1"/>
+              <w:bottom w:val="single" w:color="BBBBBB" w:sz="1"/>
+              <w:right w:val="single" w:color="BBBBBB" w:sz="1"/>
+            </w:tcBorders>
+            <w:tcMar>
+              <w:top w:type="dxa" w:w="80"/>
+              <w:left w:type="dxa" w:w="120"/>
+              <w:bottom w:type="dxa" w:w="80"/>
+              <w:right w:type="dxa" w:w="120"/>
+            </w:tcMar>
+          </w:tcPr>
+          <w:p>
+            <w:pPr>
+              <w:jc w:val="left"/>
+            </w:pPr>
+            <w:r>
+              <w:rPr>
+                <w:sz w:val="20"/>
+                <w:szCs w:val="20"/>
+              </w:rPr>
+              <w:t xml:space="preserve">(21.42, 9.05) → (28.43, 15.39)</w:t>
+            </w:r>
+          </w:p>
+        </w:tc>
+      </w:tr>
+      <w:tr>
+        <w:tc>
+          <w:tcPr>
+            <w:tcW w:type="dxa" w:w="900"/>
+            <w:tcBorders>
+              <w:top w:val="single" w:color="BBBBBB" w:sz="1"/>
+              <w:left w:val="single" w:color="BBBBBB" w:sz="1"/>
+              <w:bottom w:val="single" w:color="BBBBBB" w:sz="1"/>
+              <w:right w:val="single" w:color="BBBBBB" w:sz="1"/>
+            </w:tcBorders>
+            <w:tcMar>
+              <w:top w:type="dxa" w:w="80"/>
+              <w:left w:type="dxa" w:w="120"/>
+              <w:bottom w:type="dxa" w:w="80"/>
+              <w:right w:type="dxa" w:w="120"/>
+            </w:tcMar>
+          </w:tcPr>
+          <w:p>
+            <w:pPr>
+              <w:jc w:val="left"/>
+            </w:pPr>
+            <w:r>
+              <w:rPr>
+                <w:sz w:val="20"/>
+                <w:szCs w:val="20"/>
+              </w:rPr>
+              <w:t xml:space="preserve">45</w:t>
+            </w:r>
+          </w:p>
+        </w:tc>
+        <w:tc>
+          <w:tcPr>
+            <w:tcW w:type="dxa" w:w="1600"/>
+            <w:tcBorders>
+              <w:top w:val="single" w:color="BBBBBB" w:sz="1"/>
+              <w:left w:val="single" w:color="BBBBBB" w:sz="1"/>
+              <w:bottom w:val="single" w:color="BBBBBB" w:sz="1"/>
+              <w:right w:val="single" w:color="BBBBBB" w:sz="1"/>
+            </w:tcBorders>
+            <w:tcMar>
+              <w:top w:type="dxa" w:w="80"/>
+              <w:left w:type="dxa" w:w="120"/>
+              <w:bottom w:type="dxa" w:w="80"/>
+              <w:right w:type="dxa" w:w="120"/>
+            </w:tcMar>
+          </w:tcPr>
+          <w:p>
+            <w:pPr>
+              <w:jc w:val="right"/>
+            </w:pPr>
+            <w:r>
+              <w:rPr>
+                <w:sz w:val="20"/>
+                <w:szCs w:val="20"/>
+              </w:rPr>
+              <w:t xml:space="preserve">0.8689</w:t>
+            </w:r>
+          </w:p>
+        </w:tc>
+        <w:tc>
+          <w:tcPr>
+            <w:tcW w:type="dxa" w:w="1700"/>
+            <w:tcBorders>
+              <w:top w:val="single" w:color="BBBBBB" w:sz="1"/>
+              <w:left w:val="single" w:color="BBBBBB" w:sz="1"/>
+              <w:bottom w:val="single" w:color="BBBBBB" w:sz="1"/>
+              <w:right w:val="single" w:color="BBBBBB" w:sz="1"/>
+            </w:tcBorders>
+            <w:tcMar>
+              <w:top w:type="dxa" w:w="80"/>
+              <w:left w:type="dxa" w:w="120"/>
+              <w:bottom w:type="dxa" w:w="80"/>
+              <w:right w:type="dxa" w:w="120"/>
+            </w:tcMar>
+          </w:tcPr>
+          <w:p>
+            <w:pPr>
+              <w:jc w:val="right"/>
+            </w:pPr>
+            <w:r>
+              <w:rPr>
+                <w:sz w:val="20"/>
+                <w:szCs w:val="20"/>
+              </w:rPr>
+              <w:t xml:space="preserve">-9.745</w:t>
+            </w:r>
+          </w:p>
+        </w:tc>
+        <w:tc>
+          <w:tcPr>
+            <w:tcW w:type="dxa" w:w="4826"/>
+            <w:tcBorders>
+              <w:top w:val="single" w:color="BBBBBB" w:sz="1"/>
+              <w:left w:val="single" w:color="BBBBBB" w:sz="1"/>
+              <w:bottom w:val="single" w:color="BBBBBB" w:sz="1"/>
+              <w:right w:val="single" w:color="BBBBBB" w:sz="1"/>
+            </w:tcBorders>
+            <w:tcMar>
+              <w:top w:type="dxa" w:w="80"/>
+              <w:left w:type="dxa" w:w="120"/>
+              <w:bottom w:type="dxa" w:w="80"/>
+              <w:right w:type="dxa" w:w="120"/>
+            </w:tcMar>
+          </w:tcPr>
+          <w:p>
+            <w:pPr>
+              <w:jc w:val="left"/>
+            </w:pPr>
+            <w:r>
+              <w:rPr>
+                <w:sz w:val="20"/>
+                <w:szCs w:val="20"/>
+              </w:rPr>
+              <w:t xml:space="preserve">(21.63, 9.05) → (28.65, 15.15)</w:t>
+            </w:r>
+          </w:p>
+        </w:tc>
+      </w:tr>
+      <w:tr>
+        <w:tc>
+          <w:tcPr>
+            <w:tcW w:type="dxa" w:w="900"/>
+            <w:tcBorders>
+              <w:top w:val="single" w:color="BBBBBB" w:sz="1"/>
+              <w:left w:val="single" w:color="BBBBBB" w:sz="1"/>
+              <w:bottom w:val="single" w:color="BBBBBB" w:sz="1"/>
+              <w:right w:val="single" w:color="BBBBBB" w:sz="1"/>
+            </w:tcBorders>
+            <w:tcMar>
+              <w:top w:type="dxa" w:w="80"/>
+              <w:left w:type="dxa" w:w="120"/>
+              <w:bottom w:type="dxa" w:w="80"/>
+              <w:right w:type="dxa" w:w="120"/>
+            </w:tcMar>
+          </w:tcPr>
+          <w:p>
+            <w:pPr>
+              <w:jc w:val="left"/>
+            </w:pPr>
+            <w:r>
+              <w:rPr>
+                <w:sz w:val="20"/>
+                <w:szCs w:val="20"/>
+              </w:rPr>
+              <w:t xml:space="preserve">50</w:t>
+            </w:r>
+          </w:p>
+        </w:tc>
+        <w:tc>
+          <w:tcPr>
+            <w:tcW w:type="dxa" w:w="1600"/>
+            <w:tcBorders>
+              <w:top w:val="single" w:color="BBBBBB" w:sz="1"/>
+              <w:left w:val="single" w:color="BBBBBB" w:sz="1"/>
+              <w:bottom w:val="single" w:color="BBBBBB" w:sz="1"/>
+              <w:right w:val="single" w:color="BBBBBB" w:sz="1"/>
+            </w:tcBorders>
+            <w:tcMar>
+              <w:top w:type="dxa" w:w="80"/>
+              <w:left w:type="dxa" w:w="120"/>
+              <w:bottom w:type="dxa" w:w="80"/>
+              <w:right w:type="dxa" w:w="120"/>
+            </w:tcMar>
+          </w:tcPr>
+          <w:p>
+            <w:pPr>
+              <w:jc w:val="right"/>
+            </w:pPr>
+            <w:r>
+              <w:rPr>
+                <w:sz w:val="20"/>
+                <w:szCs w:val="20"/>
+              </w:rPr>
+              <w:t xml:space="preserve">0.8172</w:t>
+            </w:r>
+          </w:p>
+        </w:tc>
+        <w:tc>
+          <w:tcPr>
+            <w:tcW w:type="dxa" w:w="1700"/>
+            <w:tcBorders>
+              <w:top w:val="single" w:color="BBBBBB" w:sz="1"/>
+              <w:left w:val="single" w:color="BBBBBB" w:sz="1"/>
+              <w:bottom w:val="single" w:color="BBBBBB" w:sz="1"/>
+              <w:right w:val="single" w:color="BBBBBB" w:sz="1"/>
+            </w:tcBorders>
+            <w:tcMar>
+              <w:top w:type="dxa" w:w="80"/>
+              <w:left w:type="dxa" w:w="120"/>
+              <w:bottom w:type="dxa" w:w="80"/>
+              <w:right w:type="dxa" w:w="120"/>
+            </w:tcMar>
+          </w:tcPr>
+          <w:p>
+            <w:pPr>
+              <w:jc w:val="right"/>
+            </w:pPr>
+            <w:r>
+              <w:rPr>
+                <w:sz w:val="20"/>
+                <w:szCs w:val="20"/>
+              </w:rPr>
+              <w:t xml:space="preserve">-8.797</w:t>
+            </w:r>
+          </w:p>
+        </w:tc>
+        <w:tc>
+          <w:tcPr>
+            <w:tcW w:type="dxa" w:w="4826"/>
+            <w:tcBorders>
+              <w:top w:val="single" w:color="BBBBBB" w:sz="1"/>
+              <w:left w:val="single" w:color="BBBBBB" w:sz="1"/>
+              <w:bottom w:val="single" w:color="BBBBBB" w:sz="1"/>
+              <w:right w:val="single" w:color="BBBBBB" w:sz="1"/>
+            </w:tcBorders>
+            <w:tcMar>
+              <w:top w:type="dxa" w:w="80"/>
+              <w:left w:type="dxa" w:w="120"/>
+              <w:bottom w:type="dxa" w:w="80"/>
+              <w:right w:type="dxa" w:w="120"/>
+            </w:tcMar>
+          </w:tcPr>
+          <w:p>
+            <w:pPr>
+              <w:jc w:val="left"/>
+            </w:pPr>
+            <w:r>
+              <w:rPr>
+                <w:sz w:val="20"/>
+                <w:szCs w:val="20"/>
+              </w:rPr>
+              <w:t xml:space="preserve">(21.84, 9.05) → (28.95, 14.86)</w:t>
+            </w:r>
+          </w:p>
+        </w:tc>
+      </w:tr>
+      <w:tr>
+        <w:tc>
+          <w:tcPr>
+            <w:tcW w:type="dxa" w:w="900"/>
+            <w:tcBorders>
+              <w:top w:val="single" w:color="BBBBBB" w:sz="1"/>
+              <w:left w:val="single" w:color="BBBBBB" w:sz="1"/>
+              <w:bottom w:val="single" w:color="BBBBBB" w:sz="1"/>
+              <w:right w:val="single" w:color="BBBBBB" w:sz="1"/>
+            </w:tcBorders>
+            <w:tcMar>
+              <w:top w:type="dxa" w:w="80"/>
+              <w:left w:type="dxa" w:w="120"/>
+              <w:bottom w:type="dxa" w:w="80"/>
+              <w:right w:type="dxa" w:w="120"/>
+            </w:tcMar>
+          </w:tcPr>
+          <w:p>
+            <w:pPr>
+              <w:jc w:val="left"/>
+            </w:pPr>
+            <w:r>
+              <w:rPr>
+                <w:sz w:val="20"/>
+                <w:szCs w:val="20"/>
+              </w:rPr>
+              <w:t xml:space="preserve">55</w:t>
+            </w:r>
+          </w:p>
+        </w:tc>
+        <w:tc>
+          <w:tcPr>
+            <w:tcW w:type="dxa" w:w="1600"/>
+            <w:tcBorders>
+              <w:top w:val="single" w:color="BBBBBB" w:sz="1"/>
+              <w:left w:val="single" w:color="BBBBBB" w:sz="1"/>
+              <w:bottom w:val="single" w:color="BBBBBB" w:sz="1"/>
+              <w:right w:val="single" w:color="BBBBBB" w:sz="1"/>
+            </w:tcBorders>
+            <w:tcMar>
+              <w:top w:type="dxa" w:w="80"/>
+              <w:left w:type="dxa" w:w="120"/>
+              <w:bottom w:type="dxa" w:w="80"/>
+              <w:right w:type="dxa" w:w="120"/>
+            </w:tcMar>
+          </w:tcPr>
+          <w:p>
+            <w:pPr>
+              <w:jc w:val="right"/>
+            </w:pPr>
+            <w:r>
+              <w:rPr>
+                <w:sz w:val="20"/>
+                <w:szCs w:val="20"/>
+              </w:rPr>
+              <w:t xml:space="preserve">0.7977</w:t>
+            </w:r>
+          </w:p>
+        </w:tc>
+        <w:tc>
+          <w:tcPr>
+            <w:tcW w:type="dxa" w:w="1700"/>
+            <w:tcBorders>
+              <w:top w:val="single" w:color="BBBBBB" w:sz="1"/>
+              <w:left w:val="single" w:color="BBBBBB" w:sz="1"/>
+              <w:bottom w:val="single" w:color="BBBBBB" w:sz="1"/>
+              <w:right w:val="single" w:color="BBBBBB" w:sz="1"/>
+            </w:tcBorders>
+            <w:tcMar>
+              <w:top w:type="dxa" w:w="80"/>
+              <w:left w:type="dxa" w:w="120"/>
+              <w:bottom w:type="dxa" w:w="80"/>
+              <w:right w:type="dxa" w:w="120"/>
+            </w:tcMar>
+          </w:tcPr>
+          <w:p>
+            <w:pPr>
+              <w:jc w:val="right"/>
+            </w:pPr>
+            <w:r>
+              <w:rPr>
+                <w:sz w:val="20"/>
+                <w:szCs w:val="20"/>
+              </w:rPr>
+              <w:t xml:space="preserve">-8.588</w:t>
+            </w:r>
+          </w:p>
+        </w:tc>
+        <w:tc>
+          <w:tcPr>
+            <w:tcW w:type="dxa" w:w="4826"/>
+            <w:tcBorders>
+              <w:top w:val="single" w:color="BBBBBB" w:sz="1"/>
+              <w:left w:val="single" w:color="BBBBBB" w:sz="1"/>
+              <w:bottom w:val="single" w:color="BBBBBB" w:sz="1"/>
+              <w:right w:val="single" w:color="BBBBBB" w:sz="1"/>
+            </w:tcBorders>
+            <w:tcMar>
+              <w:top w:type="dxa" w:w="80"/>
+              <w:left w:type="dxa" w:w="120"/>
+              <w:bottom w:type="dxa" w:w="80"/>
+              <w:right w:type="dxa" w:w="120"/>
+            </w:tcMar>
+          </w:tcPr>
+          <w:p>
+            <w:pPr>
+              <w:jc w:val="left"/>
+            </w:pPr>
+            <w:r>
+              <w:rPr>
+                <w:sz w:val="20"/>
+                <w:szCs w:val="20"/>
+              </w:rPr>
+              <w:t xml:space="preserve">(22.11, 9.05) → (29.13, 14.65)</w:t>
+            </w:r>
+          </w:p>
+        </w:tc>
+      </w:tr>
+      <w:tr>
+        <w:tc>
+          <w:tcPr>
+            <w:tcW w:type="dxa" w:w="900"/>
+            <w:tcBorders>
+              <w:top w:val="single" w:color="BBBBBB" w:sz="1"/>
+              <w:left w:val="single" w:color="BBBBBB" w:sz="1"/>
+              <w:bottom w:val="single" w:color="BBBBBB" w:sz="1"/>
+              <w:right w:val="single" w:color="BBBBBB" w:sz="1"/>
+            </w:tcBorders>
+            <w:tcMar>
+              <w:top w:type="dxa" w:w="80"/>
+              <w:left w:type="dxa" w:w="120"/>
+              <w:bottom w:type="dxa" w:w="80"/>
+              <w:right w:type="dxa" w:w="120"/>
+            </w:tcMar>
+          </w:tcPr>
+          <w:p>
+            <w:pPr>
+              <w:jc w:val="left"/>
+            </w:pPr>
+            <w:r>
+              <w:rPr>
+                <w:sz w:val="20"/>
+                <w:szCs w:val="20"/>
+              </w:rPr>
+              <w:t xml:space="preserve">60</w:t>
+            </w:r>
+          </w:p>
+        </w:tc>
+        <w:tc>
+          <w:tcPr>
+            <w:tcW w:type="dxa" w:w="1600"/>
+            <w:tcBorders>
+              <w:top w:val="single" w:color="BBBBBB" w:sz="1"/>
+              <w:left w:val="single" w:color="BBBBBB" w:sz="1"/>
+              <w:bottom w:val="single" w:color="BBBBBB" w:sz="1"/>
+              <w:right w:val="single" w:color="BBBBBB" w:sz="1"/>
+            </w:tcBorders>
+            <w:tcMar>
+              <w:top w:type="dxa" w:w="80"/>
+              <w:left w:type="dxa" w:w="120"/>
+              <w:bottom w:type="dxa" w:w="80"/>
+              <w:right w:type="dxa" w:w="120"/>
+            </w:tcMar>
+          </w:tcPr>
+          <w:p>
+            <w:pPr>
+              <w:jc w:val="right"/>
+            </w:pPr>
+            <w:r>
+              <w:rPr>
+                <w:sz w:val="20"/>
+                <w:szCs w:val="20"/>
+              </w:rPr>
+              <w:t xml:space="preserve">0.7731</w:t>
+            </w:r>
+          </w:p>
+        </w:tc>
+        <w:tc>
+          <w:tcPr>
+            <w:tcW w:type="dxa" w:w="1700"/>
+            <w:tcBorders>
+              <w:top w:val="single" w:color="BBBBBB" w:sz="1"/>
+              <w:left w:val="single" w:color="BBBBBB" w:sz="1"/>
+              <w:bottom w:val="single" w:color="BBBBBB" w:sz="1"/>
+              <w:right w:val="single" w:color="BBBBBB" w:sz="1"/>
+            </w:tcBorders>
+            <w:tcMar>
+              <w:top w:type="dxa" w:w="80"/>
+              <w:left w:type="dxa" w:w="120"/>
+              <w:bottom w:type="dxa" w:w="80"/>
+              <w:right w:type="dxa" w:w="120"/>
+            </w:tcMar>
+          </w:tcPr>
+          <w:p>
+            <w:pPr>
+              <w:jc w:val="right"/>
+            </w:pPr>
+            <w:r>
+              <w:rPr>
+                <w:sz w:val="20"/>
+                <w:szCs w:val="20"/>
+              </w:rPr>
+              <w:t xml:space="preserve">-8.283</w:t>
+            </w:r>
+          </w:p>
+        </w:tc>
+        <w:tc>
+          <w:tcPr>
+            <w:tcW w:type="dxa" w:w="4826"/>
+            <w:tcBorders>
+              <w:top w:val="single" w:color="BBBBBB" w:sz="1"/>
+              <w:left w:val="single" w:color="BBBBBB" w:sz="1"/>
+              <w:bottom w:val="single" w:color="BBBBBB" w:sz="1"/>
+              <w:right w:val="single" w:color="BBBBBB" w:sz="1"/>
+            </w:tcBorders>
+            <w:tcMar>
+              <w:top w:type="dxa" w:w="80"/>
+              <w:left w:type="dxa" w:w="120"/>
+              <w:bottom w:type="dxa" w:w="80"/>
+              <w:right w:type="dxa" w:w="120"/>
+            </w:tcMar>
+          </w:tcPr>
+          <w:p>
+            <w:pPr>
+              <w:jc w:val="left"/>
+            </w:pPr>
+            <w:r>
+              <w:rPr>
+                <w:sz w:val="20"/>
+                <w:szCs w:val="20"/>
+              </w:rPr>
+              <w:t xml:space="preserve">(22.42, 9.05) → (29.34, 14.40)</w:t>
+            </w:r>
+          </w:p>
+        </w:tc>
+      </w:tr>
+      <w:tr>
+        <w:tc>
+          <w:tcPr>
+            <w:tcW w:type="dxa" w:w="900"/>
+            <w:tcBorders>
+              <w:top w:val="single" w:color="BBBBBB" w:sz="1"/>
+              <w:left w:val="single" w:color="BBBBBB" w:sz="1"/>
+              <w:bottom w:val="single" w:color="BBBBBB" w:sz="1"/>
+              <w:right w:val="single" w:color="BBBBBB" w:sz="1"/>
+            </w:tcBorders>
+            <w:tcMar>
+              <w:top w:type="dxa" w:w="80"/>
+              <w:left w:type="dxa" w:w="120"/>
+              <w:bottom w:type="dxa" w:w="80"/>
+              <w:right w:type="dxa" w:w="120"/>
+            </w:tcMar>
+          </w:tcPr>
+          <w:p>
+            <w:pPr>
+              <w:jc w:val="left"/>
+            </w:pPr>
+            <w:r>
+              <w:rPr>
+                <w:sz w:val="20"/>
+                <w:szCs w:val="20"/>
+              </w:rPr>
+              <w:t xml:space="preserve">65</w:t>
+            </w:r>
+          </w:p>
+        </w:tc>
+        <w:tc>
+          <w:tcPr>
+            <w:tcW w:type="dxa" w:w="1600"/>
+            <w:tcBorders>
+              <w:top w:val="single" w:color="BBBBBB" w:sz="1"/>
+              <w:left w:val="single" w:color="BBBBBB" w:sz="1"/>
+              <w:bottom w:val="single" w:color="BBBBBB" w:sz="1"/>
+              <w:right w:val="single" w:color="BBBBBB" w:sz="1"/>
+            </w:tcBorders>
+            <w:tcMar>
+              <w:top w:type="dxa" w:w="80"/>
+              <w:left w:type="dxa" w:w="120"/>
+              <w:bottom w:type="dxa" w:w="80"/>
+              <w:right w:type="dxa" w:w="120"/>
+            </w:tcMar>
+          </w:tcPr>
+          <w:p>
+            <w:pPr>
+              <w:jc w:val="right"/>
+            </w:pPr>
+            <w:r>
+              <w:rPr>
+                <w:sz w:val="20"/>
+                <w:szCs w:val="20"/>
+              </w:rPr>
+              <w:t xml:space="preserve">0.7445</w:t>
+            </w:r>
+          </w:p>
+        </w:tc>
+        <w:tc>
+          <w:tcPr>
+            <w:tcW w:type="dxa" w:w="1700"/>
+            <w:tcBorders>
+              <w:top w:val="single" w:color="BBBBBB" w:sz="1"/>
+              <w:left w:val="single" w:color="BBBBBB" w:sz="1"/>
+              <w:bottom w:val="single" w:color="BBBBBB" w:sz="1"/>
+              <w:right w:val="single" w:color="BBBBBB" w:sz="1"/>
+            </w:tcBorders>
+            <w:tcMar>
+              <w:top w:type="dxa" w:w="80"/>
+              <w:left w:type="dxa" w:w="120"/>
+              <w:bottom w:type="dxa" w:w="80"/>
+              <w:right w:type="dxa" w:w="120"/>
+            </w:tcMar>
+          </w:tcPr>
+          <w:p>
+            <w:pPr>
+              <w:jc w:val="right"/>
+            </w:pPr>
+            <w:r>
+              <w:rPr>
+                <w:sz w:val="20"/>
+                <w:szCs w:val="20"/>
+              </w:rPr>
+              <w:t xml:space="preserve">-7.855</w:t>
+            </w:r>
+          </w:p>
+        </w:tc>
+        <w:tc>
+          <w:tcPr>
+            <w:tcW w:type="dxa" w:w="4826"/>
+            <w:tcBorders>
+              <w:top w:val="single" w:color="BBBBBB" w:sz="1"/>
+              <w:left w:val="single" w:color="BBBBBB" w:sz="1"/>
+              <w:bottom w:val="single" w:color="BBBBBB" w:sz="1"/>
+              <w:right w:val="single" w:color="BBBBBB" w:sz="1"/>
+            </w:tcBorders>
+            <w:tcMar>
+              <w:top w:type="dxa" w:w="80"/>
+              <w:left w:type="dxa" w:w="120"/>
+              <w:bottom w:type="dxa" w:w="80"/>
+              <w:right w:type="dxa" w:w="120"/>
+            </w:tcMar>
+          </w:tcPr>
+          <w:p>
+            <w:pPr>
+              <w:jc w:val="left"/>
+            </w:pPr>
+            <w:r>
+              <w:rPr>
+                <w:sz w:val="20"/>
+                <w:szCs w:val="20"/>
+              </w:rPr>
+              <w:t xml:space="preserve">(22.72, 9.06) → (29.53, 14.13)</w:t>
+            </w:r>
+          </w:p>
+        </w:tc>
+      </w:tr>
+      <w:tr>
+        <w:tc>
+          <w:tcPr>
+            <w:tcW w:type="dxa" w:w="900"/>
+            <w:tcBorders>
+              <w:top w:val="single" w:color="BBBBBB" w:sz="1"/>
+              <w:left w:val="single" w:color="BBBBBB" w:sz="1"/>
+              <w:bottom w:val="single" w:color="BBBBBB" w:sz="1"/>
+              <w:right w:val="single" w:color="BBBBBB" w:sz="1"/>
+            </w:tcBorders>
+            <w:tcMar>
+              <w:top w:type="dxa" w:w="80"/>
+              <w:left w:type="dxa" w:w="120"/>
+              <w:bottom w:type="dxa" w:w="80"/>
+              <w:right w:type="dxa" w:w="120"/>
+            </w:tcMar>
+          </w:tcPr>
+          <w:p>
+            <w:pPr>
+              <w:jc w:val="left"/>
+            </w:pPr>
+            <w:r>
+              <w:rPr>
+                <w:sz w:val="20"/>
+                <w:szCs w:val="20"/>
+              </w:rPr>
+              <w:t xml:space="preserve">70</w:t>
+            </w:r>
+          </w:p>
+        </w:tc>
+        <w:tc>
+          <w:tcPr>
+            <w:tcW w:type="dxa" w:w="1600"/>
+            <w:tcBorders>
+              <w:top w:val="single" w:color="BBBBBB" w:sz="1"/>
+              <w:left w:val="single" w:color="BBBBBB" w:sz="1"/>
+              <w:bottom w:val="single" w:color="BBBBBB" w:sz="1"/>
+              <w:right w:val="single" w:color="BBBBBB" w:sz="1"/>
+            </w:tcBorders>
+            <w:tcMar>
+              <w:top w:type="dxa" w:w="80"/>
+              <w:left w:type="dxa" w:w="120"/>
+              <w:bottom w:type="dxa" w:w="80"/>
+              <w:right w:type="dxa" w:w="120"/>
+            </w:tcMar>
+          </w:tcPr>
+          <w:p>
+            <w:pPr>
+              <w:jc w:val="right"/>
+            </w:pPr>
+            <w:r>
+              <w:rPr>
+                <w:sz w:val="20"/>
+                <w:szCs w:val="20"/>
+              </w:rPr>
+              <w:t xml:space="preserve">0.6996</w:t>
+            </w:r>
+          </w:p>
+        </w:tc>
+        <w:tc>
+          <w:tcPr>
+            <w:tcW w:type="dxa" w:w="1700"/>
+            <w:tcBorders>
+              <w:top w:val="single" w:color="BBBBBB" w:sz="1"/>
+              <w:left w:val="single" w:color="BBBBBB" w:sz="1"/>
+              <w:bottom w:val="single" w:color="BBBBBB" w:sz="1"/>
+              <w:right w:val="single" w:color="BBBBBB" w:sz="1"/>
+            </w:tcBorders>
+            <w:tcMar>
+              <w:top w:type="dxa" w:w="80"/>
+              <w:left w:type="dxa" w:w="120"/>
+              <w:bottom w:type="dxa" w:w="80"/>
+              <w:right w:type="dxa" w:w="120"/>
+            </w:tcMar>
+          </w:tcPr>
+          <w:p>
+            <w:pPr>
+              <w:jc w:val="right"/>
+            </w:pPr>
+            <w:r>
+              <w:rPr>
+                <w:sz w:val="20"/>
+                <w:szCs w:val="20"/>
+              </w:rPr>
+              <w:t xml:space="preserve">-6.995</w:t>
+            </w:r>
+          </w:p>
+        </w:tc>
+        <w:tc>
+          <w:tcPr>
+            <w:tcW w:type="dxa" w:w="4826"/>
+            <w:tcBorders>
+              <w:top w:val="single" w:color="BBBBBB" w:sz="1"/>
+              <w:left w:val="single" w:color="BBBBBB" w:sz="1"/>
+              <w:bottom w:val="single" w:color="BBBBBB" w:sz="1"/>
+              <w:right w:val="single" w:color="BBBBBB" w:sz="1"/>
+            </w:tcBorders>
+            <w:tcMar>
+              <w:top w:type="dxa" w:w="80"/>
+              <w:left w:type="dxa" w:w="120"/>
+              <w:bottom w:type="dxa" w:w="80"/>
+              <w:right w:type="dxa" w:w="120"/>
+            </w:tcMar>
+          </w:tcPr>
+          <w:p>
+            <w:pPr>
+              <w:jc w:val="left"/>
+            </w:pPr>
+            <w:r>
+              <w:rPr>
+                <w:sz w:val="20"/>
+                <w:szCs w:val="20"/>
+              </w:rPr>
+              <w:t xml:space="preserve">(22.95, 9.06) → (29.74, 13.81)</w:t>
+            </w:r>
+          </w:p>
+        </w:tc>
+      </w:tr>
+      <w:tr>
+        <w:tc>
+          <w:tcPr>
+            <w:tcW w:type="dxa" w:w="900"/>
+            <w:tcBorders>
+              <w:top w:val="single" w:color="BBBBBB" w:sz="1"/>
+              <w:left w:val="single" w:color="BBBBBB" w:sz="1"/>
+              <w:bottom w:val="single" w:color="BBBBBB" w:sz="1"/>
+              <w:right w:val="single" w:color="BBBBBB" w:sz="1"/>
+            </w:tcBorders>
+            <w:tcMar>
+              <w:top w:type="dxa" w:w="80"/>
+              <w:left w:type="dxa" w:w="120"/>
+              <w:bottom w:type="dxa" w:w="80"/>
+              <w:right w:type="dxa" w:w="120"/>
+            </w:tcMar>
+          </w:tcPr>
+          <w:p>
+            <w:pPr>
+              <w:jc w:val="left"/>
+            </w:pPr>
+            <w:r>
+              <w:rPr>
+                <w:sz w:val="20"/>
+                <w:szCs w:val="20"/>
+              </w:rPr>
+              <w:t xml:space="preserve">75</w:t>
+            </w:r>
+          </w:p>
+        </w:tc>
+        <w:tc>
+          <w:tcPr>
+            <w:tcW w:type="dxa" w:w="1600"/>
+            <w:tcBorders>
+              <w:top w:val="single" w:color="BBBBBB" w:sz="1"/>
+              <w:left w:val="single" w:color="BBBBBB" w:sz="1"/>
+              <w:bottom w:val="single" w:color="BBBBBB" w:sz="1"/>
+              <w:right w:val="single" w:color="BBBBBB" w:sz="1"/>
+            </w:tcBorders>
+            <w:tcMar>
+              <w:top w:type="dxa" w:w="80"/>
+              <w:left w:type="dxa" w:w="120"/>
+              <w:bottom w:type="dxa" w:w="80"/>
+              <w:right w:type="dxa" w:w="120"/>
+            </w:tcMar>
+          </w:tcPr>
+          <w:p>
+            <w:pPr>
+              <w:jc w:val="right"/>
+            </w:pPr>
+            <w:r>
+              <w:rPr>
+                <w:sz w:val="20"/>
+                <w:szCs w:val="20"/>
+              </w:rPr>
+              <w:t xml:space="preserve">0.6529</w:t>
+            </w:r>
+          </w:p>
+        </w:tc>
+        <w:tc>
+          <w:tcPr>
+            <w:tcW w:type="dxa" w:w="1700"/>
+            <w:tcBorders>
+              <w:top w:val="single" w:color="BBBBBB" w:sz="1"/>
+              <w:left w:val="single" w:color="BBBBBB" w:sz="1"/>
+              <w:bottom w:val="single" w:color="BBBBBB" w:sz="1"/>
+              <w:right w:val="single" w:color="BBBBBB" w:sz="1"/>
+            </w:tcBorders>
+            <w:tcMar>
+              <w:top w:type="dxa" w:w="80"/>
+              <w:left w:type="dxa" w:w="120"/>
+              <w:bottom w:type="dxa" w:w="80"/>
+              <w:right w:type="dxa" w:w="120"/>
+            </w:tcMar>
+          </w:tcPr>
+          <w:p>
+            <w:pPr>
+              <w:jc w:val="right"/>
+            </w:pPr>
+            <w:r>
+              <w:rPr>
+                <w:sz w:val="20"/>
+                <w:szCs w:val="20"/>
+              </w:rPr>
+              <w:t xml:space="preserve">-6.088</w:t>
+            </w:r>
+          </w:p>
+        </w:tc>
+        <w:tc>
+          <w:tcPr>
+            <w:tcW w:type="dxa" w:w="4826"/>
+            <w:tcBorders>
+              <w:top w:val="single" w:color="BBBBBB" w:sz="1"/>
+              <w:left w:val="single" w:color="BBBBBB" w:sz="1"/>
+              <w:bottom w:val="single" w:color="BBBBBB" w:sz="1"/>
+              <w:right w:val="single" w:color="BBBBBB" w:sz="1"/>
+            </w:tcBorders>
+            <w:tcMar>
+              <w:top w:type="dxa" w:w="80"/>
+              <w:left w:type="dxa" w:w="120"/>
+              <w:bottom w:type="dxa" w:w="80"/>
+              <w:right w:type="dxa" w:w="120"/>
+            </w:tcMar>
+          </w:tcPr>
+          <w:p>
+            <w:pPr>
+              <w:jc w:val="left"/>
+            </w:pPr>
+            <w:r>
+              <w:rPr>
+                <w:sz w:val="20"/>
+                <w:szCs w:val="20"/>
+              </w:rPr>
+              <w:t xml:space="preserve">(23.20, 9.06) → (30.00, 13.50)</w:t>
+            </w:r>
+          </w:p>
+        </w:tc>
+      </w:tr>
+      <w:tr>
+        <w:tc>
+          <w:tcPr>
+            <w:tcW w:type="dxa" w:w="900"/>
+            <w:tcBorders>
+              <w:top w:val="single" w:color="BBBBBB" w:sz="1"/>
+              <w:left w:val="single" w:color="BBBBBB" w:sz="1"/>
+              <w:bottom w:val="single" w:color="BBBBBB" w:sz="1"/>
+              <w:right w:val="single" w:color="BBBBBB" w:sz="1"/>
+            </w:tcBorders>
+            <w:tcMar>
+              <w:top w:type="dxa" w:w="80"/>
+              <w:left w:type="dxa" w:w="120"/>
+              <w:bottom w:type="dxa" w:w="80"/>
+              <w:right w:type="dxa" w:w="120"/>
+            </w:tcMar>
+          </w:tcPr>
+          <w:p>
+            <w:pPr>
+              <w:jc w:val="left"/>
+            </w:pPr>
+            <w:r>
+              <w:rPr>
+                <w:sz w:val="20"/>
+                <w:szCs w:val="20"/>
+              </w:rPr>
+              <w:t xml:space="preserve">80</w:t>
+            </w:r>
+          </w:p>
+        </w:tc>
+        <w:tc>
+          <w:tcPr>
+            <w:tcW w:type="dxa" w:w="1600"/>
+            <w:tcBorders>
+              <w:top w:val="single" w:color="BBBBBB" w:sz="1"/>
+              <w:left w:val="single" w:color="BBBBBB" w:sz="1"/>
+              <w:bottom w:val="single" w:color="BBBBBB" w:sz="1"/>
+              <w:right w:val="single" w:color="BBBBBB" w:sz="1"/>
+            </w:tcBorders>
+            <w:tcMar>
+              <w:top w:type="dxa" w:w="80"/>
+              <w:left w:type="dxa" w:w="120"/>
+              <w:bottom w:type="dxa" w:w="80"/>
+              <w:right w:type="dxa" w:w="120"/>
+            </w:tcMar>
+          </w:tcPr>
+          <w:p>
+            <w:pPr>
+              <w:jc w:val="right"/>
+            </w:pPr>
+            <w:r>
+              <w:rPr>
+                <w:sz w:val="20"/>
+                <w:szCs w:val="20"/>
+              </w:rPr>
+              <w:t xml:space="preserve">0.6272</w:t>
+            </w:r>
+          </w:p>
+        </w:tc>
+        <w:tc>
+          <w:tcPr>
+            <w:tcW w:type="dxa" w:w="1700"/>
+            <w:tcBorders>
+              <w:top w:val="single" w:color="BBBBBB" w:sz="1"/>
+              <w:left w:val="single" w:color="BBBBBB" w:sz="1"/>
+              <w:bottom w:val="single" w:color="BBBBBB" w:sz="1"/>
+              <w:right w:val="single" w:color="BBBBBB" w:sz="1"/>
+            </w:tcBorders>
+            <w:tcMar>
+              <w:top w:type="dxa" w:w="80"/>
+              <w:left w:type="dxa" w:w="120"/>
+              <w:bottom w:type="dxa" w:w="80"/>
+              <w:right w:type="dxa" w:w="120"/>
+            </w:tcMar>
+          </w:tcPr>
+          <w:p>
+            <w:pPr>
+              <w:jc w:val="right"/>
+            </w:pPr>
+            <w:r>
+              <w:rPr>
+                <w:sz w:val="20"/>
+                <w:szCs w:val="20"/>
+              </w:rPr>
+              <w:t xml:space="preserve">-5.661</w:t>
+            </w:r>
+          </w:p>
+        </w:tc>
+        <w:tc>
+          <w:tcPr>
+            <w:tcW w:type="dxa" w:w="4826"/>
+            <w:tcBorders>
+              <w:top w:val="single" w:color="BBBBBB" w:sz="1"/>
+              <w:left w:val="single" w:color="BBBBBB" w:sz="1"/>
+              <w:bottom w:val="single" w:color="BBBBBB" w:sz="1"/>
+              <w:right w:val="single" w:color="BBBBBB" w:sz="1"/>
+            </w:tcBorders>
+            <w:tcMar>
+              <w:top w:type="dxa" w:w="80"/>
+              <w:left w:type="dxa" w:w="120"/>
+              <w:bottom w:type="dxa" w:w="80"/>
+              <w:right w:type="dxa" w:w="120"/>
+            </w:tcMar>
+          </w:tcPr>
+          <w:p>
+            <w:pPr>
+              <w:jc w:val="left"/>
+            </w:pPr>
+            <w:r>
+              <w:rPr>
+                <w:sz w:val="20"/>
+                <w:szCs w:val="20"/>
+              </w:rPr>
+              <w:t xml:space="preserve">(23.47, 9.06) → (30.15, 13.25)</w:t>
+            </w:r>
+          </w:p>
+        </w:tc>
+      </w:tr>
+      <w:tr>
+        <w:tc>
+          <w:tcPr>
+            <w:tcW w:type="dxa" w:w="900"/>
+            <w:tcBorders>
+              <w:top w:val="single" w:color="BBBBBB" w:sz="1"/>
+              <w:left w:val="single" w:color="BBBBBB" w:sz="1"/>
+              <w:bottom w:val="single" w:color="BBBBBB" w:sz="1"/>
+              <w:right w:val="single" w:color="BBBBBB" w:sz="1"/>
+            </w:tcBorders>
+            <w:tcMar>
+              <w:top w:type="dxa" w:w="80"/>
+              <w:left w:type="dxa" w:w="120"/>
+              <w:bottom w:type="dxa" w:w="80"/>
+              <w:right w:type="dxa" w:w="120"/>
+            </w:tcMar>
+          </w:tcPr>
+          <w:p>
+            <w:pPr>
+              <w:jc w:val="left"/>
+            </w:pPr>
+            <w:r>
+              <w:rPr>
+                <w:sz w:val="20"/>
+                <w:szCs w:val="20"/>
+              </w:rPr>
+              <w:t xml:space="preserve">85</w:t>
+            </w:r>
+          </w:p>
+        </w:tc>
+        <w:tc>
+          <w:tcPr>
+            <w:tcW w:type="dxa" w:w="1600"/>
+            <w:tcBorders>
+              <w:top w:val="single" w:color="BBBBBB" w:sz="1"/>
+              <w:left w:val="single" w:color="BBBBBB" w:sz="1"/>
+              <w:bottom w:val="single" w:color="BBBBBB" w:sz="1"/>
+              <w:right w:val="single" w:color="BBBBBB" w:sz="1"/>
+            </w:tcBorders>
+            <w:tcMar>
+              <w:top w:type="dxa" w:w="80"/>
+              <w:left w:type="dxa" w:w="120"/>
+              <w:bottom w:type="dxa" w:w="80"/>
+              <w:right w:type="dxa" w:w="120"/>
+            </w:tcMar>
+          </w:tcPr>
+          <w:p>
+            <w:pPr>
+              <w:jc w:val="right"/>
+            </w:pPr>
+            <w:r>
+              <w:rPr>
+                <w:sz w:val="20"/>
+                <w:szCs w:val="20"/>
+              </w:rPr>
+              <w:t xml:space="preserve">0.6022</w:t>
+            </w:r>
+          </w:p>
+        </w:tc>
+        <w:tc>
+          <w:tcPr>
+            <w:tcW w:type="dxa" w:w="1700"/>
+            <w:tcBorders>
+              <w:top w:val="single" w:color="BBBBBB" w:sz="1"/>
+              <w:left w:val="single" w:color="BBBBBB" w:sz="1"/>
+              <w:bottom w:val="single" w:color="BBBBBB" w:sz="1"/>
+              <w:right w:val="single" w:color="BBBBBB" w:sz="1"/>
+            </w:tcBorders>
+            <w:tcMar>
+              <w:top w:type="dxa" w:w="80"/>
+              <w:left w:type="dxa" w:w="120"/>
+              <w:bottom w:type="dxa" w:w="80"/>
+              <w:right w:type="dxa" w:w="120"/>
+            </w:tcMar>
+          </w:tcPr>
+          <w:p>
+            <w:pPr>
+              <w:jc w:val="right"/>
+            </w:pPr>
+            <w:r>
+              <w:rPr>
+                <w:sz w:val="20"/>
+                <w:szCs w:val="20"/>
+              </w:rPr>
+              <w:t xml:space="preserve">-5.265</w:t>
+            </w:r>
+          </w:p>
+        </w:tc>
+        <w:tc>
+          <w:tcPr>
+            <w:tcW w:type="dxa" w:w="4826"/>
+            <w:tcBorders>
+              <w:top w:val="single" w:color="BBBBBB" w:sz="1"/>
+              <w:left w:val="single" w:color="BBBBBB" w:sz="1"/>
+              <w:bottom w:val="single" w:color="BBBBBB" w:sz="1"/>
+              <w:right w:val="single" w:color="BBBBBB" w:sz="1"/>
+            </w:tcBorders>
+            <w:tcMar>
+              <w:top w:type="dxa" w:w="80"/>
+              <w:left w:type="dxa" w:w="120"/>
+              <w:bottom w:type="dxa" w:w="80"/>
+              <w:right w:type="dxa" w:w="120"/>
+            </w:tcMar>
+          </w:tcPr>
+          <w:p>
+            <w:pPr>
+              <w:jc w:val="left"/>
+            </w:pPr>
+            <w:r>
+              <w:rPr>
+                <w:sz w:val="20"/>
+                <w:szCs w:val="20"/>
+              </w:rPr>
+              <w:t xml:space="preserve">(23.79, 9.06) → (30.30, 12.98)</w:t>
+            </w:r>
+          </w:p>
+        </w:tc>
+      </w:tr>
+      <w:tr>
+        <w:tc>
+          <w:tcPr>
+            <w:tcW w:type="dxa" w:w="900"/>
+            <w:tcBorders>
+              <w:top w:val="single" w:color="BBBBBB" w:sz="1"/>
+              <w:left w:val="single" w:color="BBBBBB" w:sz="1"/>
+              <w:bottom w:val="single" w:color="BBBBBB" w:sz="1"/>
+              <w:right w:val="single" w:color="BBBBBB" w:sz="1"/>
+            </w:tcBorders>
+            <w:tcMar>
+              <w:top w:type="dxa" w:w="80"/>
+              <w:left w:type="dxa" w:w="120"/>
+              <w:bottom w:type="dxa" w:w="80"/>
+              <w:right w:type="dxa" w:w="120"/>
+            </w:tcMar>
+          </w:tcPr>
+          <w:p>
+            <w:pPr>
+              <w:jc w:val="left"/>
+            </w:pPr>
+            <w:r>
+              <w:rPr>
+                <w:sz w:val="20"/>
+                <w:szCs w:val="20"/>
+              </w:rPr>
+              <w:t xml:space="preserve">90</w:t>
+            </w:r>
+          </w:p>
+        </w:tc>
+        <w:tc>
+          <w:tcPr>
+            <w:tcW w:type="dxa" w:w="1600"/>
+            <w:tcBorders>
+              <w:top w:val="single" w:color="BBBBBB" w:sz="1"/>
+              <w:left w:val="single" w:color="BBBBBB" w:sz="1"/>
+              <w:bottom w:val="single" w:color="BBBBBB" w:sz="1"/>
+              <w:right w:val="single" w:color="BBBBBB" w:sz="1"/>
+            </w:tcBorders>
+            <w:tcMar>
+              <w:top w:type="dxa" w:w="80"/>
+              <w:left w:type="dxa" w:w="120"/>
+              <w:bottom w:type="dxa" w:w="80"/>
+              <w:right w:type="dxa" w:w="120"/>
+            </w:tcMar>
+          </w:tcPr>
+          <w:p>
+            <w:pPr>
+              <w:jc w:val="right"/>
+            </w:pPr>
+            <w:r>
+              <w:rPr>
+                <w:sz w:val="20"/>
+                <w:szCs w:val="20"/>
+              </w:rPr>
+              <w:t xml:space="preserve">0.5674</w:t>
+            </w:r>
+          </w:p>
+        </w:tc>
+        <w:tc>
+          <w:tcPr>
+            <w:tcW w:type="dxa" w:w="1700"/>
+            <w:tcBorders>
+              <w:top w:val="single" w:color="BBBBBB" w:sz="1"/>
+              <w:left w:val="single" w:color="BBBBBB" w:sz="1"/>
+              <w:bottom w:val="single" w:color="BBBBBB" w:sz="1"/>
+              <w:right w:val="single" w:color="BBBBBB" w:sz="1"/>
+            </w:tcBorders>
+            <w:tcMar>
+              <w:top w:type="dxa" w:w="80"/>
+              <w:left w:type="dxa" w:w="120"/>
+              <w:bottom w:type="dxa" w:w="80"/>
+              <w:right w:type="dxa" w:w="120"/>
+            </w:tcMar>
+          </w:tcPr>
+          <w:p>
+            <w:pPr>
+              <w:jc w:val="right"/>
+            </w:pPr>
+            <w:r>
+              <w:rPr>
+                <w:sz w:val="20"/>
+                <w:szCs w:val="20"/>
+              </w:rPr>
+              <w:t xml:space="preserve">-4.657</w:t>
+            </w:r>
+          </w:p>
+        </w:tc>
+        <w:tc>
+          <w:tcPr>
+            <w:tcW w:type="dxa" w:w="4826"/>
+            <w:tcBorders>
+              <w:top w:val="single" w:color="BBBBBB" w:sz="1"/>
+              <w:left w:val="single" w:color="BBBBBB" w:sz="1"/>
+              <w:bottom w:val="single" w:color="BBBBBB" w:sz="1"/>
+              <w:right w:val="single" w:color="BBBBBB" w:sz="1"/>
+            </w:tcBorders>
+            <w:tcMar>
+              <w:top w:type="dxa" w:w="80"/>
+              <w:left w:type="dxa" w:w="120"/>
+              <w:bottom w:type="dxa" w:w="80"/>
+              <w:right w:type="dxa" w:w="120"/>
+            </w:tcMar>
+          </w:tcPr>
+          <w:p>
+            <w:pPr>
+              <w:jc w:val="left"/>
+            </w:pPr>
+            <w:r>
+              <w:rPr>
+                <w:sz w:val="20"/>
+                <w:szCs w:val="20"/>
+              </w:rPr>
+              <w:t xml:space="preserve">(24.16, 9.05) → (30.47, 12.63)</w:t>
+            </w:r>
+          </w:p>
+        </w:tc>
+      </w:tr>
+      <w:tr>
+        <w:tc>
+          <w:tcPr>
+            <w:tcW w:type="dxa" w:w="900"/>
+            <w:tcBorders>
+              <w:top w:val="single" w:color="BBBBBB" w:sz="1"/>
+              <w:left w:val="single" w:color="BBBBBB" w:sz="1"/>
+              <w:bottom w:val="single" w:color="BBBBBB" w:sz="1"/>
+              <w:right w:val="single" w:color="BBBBBB" w:sz="1"/>
+            </w:tcBorders>
+            <w:tcMar>
+              <w:top w:type="dxa" w:w="80"/>
+              <w:left w:type="dxa" w:w="120"/>
+              <w:bottom w:type="dxa" w:w="80"/>
+              <w:right w:type="dxa" w:w="120"/>
+            </w:tcMar>
+          </w:tcPr>
+          <w:p>
+            <w:pPr>
+              <w:jc w:val="left"/>
+            </w:pPr>
+            <w:r>
+              <w:rPr>
+                <w:sz w:val="20"/>
+                <w:szCs w:val="20"/>
+              </w:rPr>
+              <w:t xml:space="preserve">95</w:t>
+            </w:r>
+          </w:p>
+        </w:tc>
+        <w:tc>
+          <w:tcPr>
+            <w:tcW w:type="dxa" w:w="1600"/>
+            <w:tcBorders>
+              <w:top w:val="single" w:color="BBBBBB" w:sz="1"/>
+              <w:left w:val="single" w:color="BBBBBB" w:sz="1"/>
+              <w:bottom w:val="single" w:color="BBBBBB" w:sz="1"/>
+              <w:right w:val="single" w:color="BBBBBB" w:sz="1"/>
+            </w:tcBorders>
+            <w:tcMar>
+              <w:top w:type="dxa" w:w="80"/>
+              <w:left w:type="dxa" w:w="120"/>
+              <w:bottom w:type="dxa" w:w="80"/>
+              <w:right w:type="dxa" w:w="120"/>
+            </w:tcMar>
+          </w:tcPr>
+          <w:p>
+            <w:pPr>
+              <w:jc w:val="right"/>
+            </w:pPr>
+            <w:r>
+              <w:rPr>
+                <w:sz w:val="20"/>
+                <w:szCs w:val="20"/>
+              </w:rPr>
+              <w:t xml:space="preserve">0.5212</w:t>
+            </w:r>
+          </w:p>
+        </w:tc>
+        <w:tc>
+          <w:tcPr>
+            <w:tcW w:type="dxa" w:w="1700"/>
+            <w:tcBorders>
+              <w:top w:val="single" w:color="BBBBBB" w:sz="1"/>
+              <w:left w:val="single" w:color="BBBBBB" w:sz="1"/>
+              <w:bottom w:val="single" w:color="BBBBBB" w:sz="1"/>
+              <w:right w:val="single" w:color="BBBBBB" w:sz="1"/>
+            </w:tcBorders>
+            <w:tcMar>
+              <w:top w:type="dxa" w:w="80"/>
+              <w:left w:type="dxa" w:w="120"/>
+              <w:bottom w:type="dxa" w:w="80"/>
+              <w:right w:type="dxa" w:w="120"/>
+            </w:tcMar>
+          </w:tcPr>
+          <w:p>
+            <w:pPr>
+              <w:jc w:val="right"/>
+            </w:pPr>
+            <w:r>
+              <w:rPr>
+                <w:sz w:val="20"/>
+                <w:szCs w:val="20"/>
+              </w:rPr>
+              <w:t xml:space="preserve">-3.703</w:t>
+            </w:r>
+          </w:p>
+        </w:tc>
+        <w:tc>
+          <w:tcPr>
+            <w:tcW w:type="dxa" w:w="4826"/>
+            <w:tcBorders>
+              <w:top w:val="single" w:color="BBBBBB" w:sz="1"/>
+              <w:left w:val="single" w:color="BBBBBB" w:sz="1"/>
+              <w:bottom w:val="single" w:color="BBBBBB" w:sz="1"/>
+              <w:right w:val="single" w:color="BBBBBB" w:sz="1"/>
+            </w:tcBorders>
+            <w:tcMar>
+              <w:top w:type="dxa" w:w="80"/>
+              <w:left w:type="dxa" w:w="120"/>
+              <w:bottom w:type="dxa" w:w="80"/>
+              <w:right w:type="dxa" w:w="120"/>
+            </w:tcMar>
+          </w:tcPr>
+          <w:p>
+            <w:pPr>
+              <w:jc w:val="left"/>
+            </w:pPr>
+            <w:r>
+              <w:rPr>
+                <w:sz w:val="20"/>
+                <w:szCs w:val="20"/>
+              </w:rPr>
+              <w:t xml:space="preserve">(24.47, 9.05) → (30.61, 12.25)</w:t>
+            </w:r>
+          </w:p>
+        </w:tc>
+      </w:tr>
+      <w:tr>
+        <w:tc>
+          <w:tcPr>
+            <w:tcW w:type="dxa" w:w="900"/>
+            <w:tcBorders>
+              <w:top w:val="single" w:color="BBBBBB" w:sz="1"/>
+              <w:left w:val="single" w:color="BBBBBB" w:sz="1"/>
+              <w:bottom w:val="single" w:color="BBBBBB" w:sz="1"/>
+              <w:right w:val="single" w:color="BBBBBB" w:sz="1"/>
+            </w:tcBorders>
+            <w:tcMar>
+              <w:top w:type="dxa" w:w="80"/>
+              <w:left w:type="dxa" w:w="120"/>
+              <w:bottom w:type="dxa" w:w="80"/>
+              <w:right w:type="dxa" w:w="120"/>
+            </w:tcMar>
+          </w:tcPr>
+          <w:p>
+            <w:pPr>
+              <w:jc w:val="left"/>
+            </w:pPr>
+            <w:r>
+              <w:rPr>
+                <w:sz w:val="20"/>
+                <w:szCs w:val="20"/>
+              </w:rPr>
+              <w:t xml:space="preserve">100</w:t>
+            </w:r>
+          </w:p>
+        </w:tc>
+        <w:tc>
+          <w:tcPr>
+            <w:tcW w:type="dxa" w:w="1600"/>
+            <w:tcBorders>
+              <w:top w:val="single" w:color="BBBBBB" w:sz="1"/>
+              <w:left w:val="single" w:color="BBBBBB" w:sz="1"/>
+              <w:bottom w:val="single" w:color="BBBBBB" w:sz="1"/>
+              <w:right w:val="single" w:color="BBBBBB" w:sz="1"/>
+            </w:tcBorders>
+            <w:tcMar>
+              <w:top w:type="dxa" w:w="80"/>
+              <w:left w:type="dxa" w:w="120"/>
+              <w:bottom w:type="dxa" w:w="80"/>
+              <w:right w:type="dxa" w:w="120"/>
+            </w:tcMar>
+          </w:tcPr>
+          <w:p>
+            <w:pPr>
+              <w:jc w:val="right"/>
+            </w:pPr>
+            <w:r>
+              <w:rPr>
+                <w:sz w:val="20"/>
+                <w:szCs w:val="20"/>
+              </w:rPr>
+              <w:t xml:space="preserve">0.4733</w:t>
+            </w:r>
+          </w:p>
+        </w:tc>
+        <w:tc>
+          <w:tcPr>
+            <w:tcW w:type="dxa" w:w="1700"/>
+            <w:tcBorders>
+              <w:top w:val="single" w:color="BBBBBB" w:sz="1"/>
+              <w:left w:val="single" w:color="BBBBBB" w:sz="1"/>
+              <w:bottom w:val="single" w:color="BBBBBB" w:sz="1"/>
+              <w:right w:val="single" w:color="BBBBBB" w:sz="1"/>
+            </w:tcBorders>
+            <w:tcMar>
+              <w:top w:type="dxa" w:w="80"/>
+              <w:left w:type="dxa" w:w="120"/>
+              <w:bottom w:type="dxa" w:w="80"/>
+              <w:right w:type="dxa" w:w="120"/>
+            </w:tcMar>
+          </w:tcPr>
+          <w:p>
+            <w:pPr>
+              <w:jc w:val="right"/>
+            </w:pPr>
+            <w:r>
+              <w:rPr>
+                <w:sz w:val="20"/>
+                <w:szCs w:val="20"/>
+              </w:rPr>
+              <w:t xml:space="preserve">-2.731</w:t>
+            </w:r>
+          </w:p>
+        </w:tc>
+        <w:tc>
+          <w:tcPr>
+            <w:tcW w:type="dxa" w:w="4826"/>
+            <w:tcBorders>
+              <w:top w:val="single" w:color="BBBBBB" w:sz="1"/>
+              <w:left w:val="single" w:color="BBBBBB" w:sz="1"/>
+              <w:bottom w:val="single" w:color="BBBBBB" w:sz="1"/>
+              <w:right w:val="single" w:color="BBBBBB" w:sz="1"/>
+            </w:tcBorders>
+            <w:tcMar>
+              <w:top w:type="dxa" w:w="80"/>
+              <w:left w:type="dxa" w:w="120"/>
+              <w:bottom w:type="dxa" w:w="80"/>
+              <w:right w:type="dxa" w:w="120"/>
+            </w:tcMar>
+          </w:tcPr>
+          <w:p>
+            <w:pPr>
+              <w:jc w:val="left"/>
+            </w:pPr>
+            <w:r>
+              <w:rPr>
+                <w:sz w:val="20"/>
+                <w:szCs w:val="20"/>
+              </w:rPr>
+              <w:t xml:space="preserve">(24.89, 9.05) → (30.70, 11.80)</w:t>
+            </w:r>
+          </w:p>
+        </w:tc>
+      </w:tr>
+    </w:tbl>
+    <w:p>
+      <w:pPr>
+        <w:spacing w:before="200" w:after="160"/>
+      </w:pPr>
+      <w:r>
+        <w:rPr>
+          <w:b/>
+          <w:bCs/>
+        </w:rPr>
+        <w:t xml:space="preserve">FN 0 is the exception: </w:t>
+      </w:r>
+      <w:r>
+        <w:t xml:space="preserve">in the original figure it is drawn dash-dot and is visibly curved, so it cannot be described by a single a + b·Cr</w:t>
+      </w:r>
+      <w:r>
+        <w:rPr>
+          <w:vertAlign w:val="subscript"/>
+        </w:rPr>
+        <w:t xml:space="preserve">eq</w:t>
+      </w:r>
+      <w:r>
+        <w:t xml:space="preserve"> equation. It is stored as a ten-point polyline: </w:t>
+      </w:r>
+      <w:r>
+        <w:rPr>
+          <w:rFonts w:ascii="Consolas" w:cs="Consolas" w:eastAsia="Consolas" w:hAnsi="Consolas"/>
+          <w:sz w:val="18"/>
+          <w:szCs w:val="18"/>
+        </w:rPr>
+        <w:t xml:space="preserve">(17.23, 12.47)  (17.60, 12.94)  (18.08, 13.54)  (18.57, 14.15)  (19.23, 14.95)  (19.61, 15.41)  (20.12, 16.05)  (20.52, 16.55)  (21.17, 17.36)  (21.53, 17.74)</w:t>
+      </w:r>
+      <w:r>
+        <w:t xml:space="preserve">.</w:t>
+      </w:r>
+    </w:p>
+    <w:p>
+      <w:pPr>
+        <w:spacing w:after="160"/>
+      </w:pPr>
+      <w:r>
+        <w:t xml:space="preserve">Three caveats apply when using these coefficients:</w:t>
+      </w:r>
+    </w:p>
+    <w:p>
+      <w:pPr>
+        <w:pStyle w:val="ListParagraph"/>
+        <w:numPr>
+          <w:ilvl w:val="0"/>
+          <w:numId w:val="2"/>
+        </w:numPr>
+        <w:spacing w:after="80"/>
+      </w:pPr>
+      <w:r>
+        <w:rPr>
+          <w:b/>
+          <w:bCs/>
+        </w:rPr>
+        <w:t xml:space="preserve">They are digitized, not the original regression. </w:t>
+      </w:r>
+      <w:r>
+        <w:t xml:space="preserve">The values derive from the drawn figure (accuracy about ±0.05 equivalent units), not from Kotecki &amp; Siewert’s unpublished regression equations. They do, however, reproduce the paper’s own worked examples to within 0.5 FN, so for practical and teaching purposes they are equivalent.</w:t>
+      </w:r>
+    </w:p>
+    <w:p>
+      <w:pPr>
+        <w:pStyle w:val="ListParagraph"/>
+        <w:numPr>
+          <w:ilvl w:val="0"/>
+          <w:numId w:val="2"/>
+        </w:numPr>
+        <w:spacing w:after="80"/>
+      </w:pPr>
+      <w:r>
+        <w:rPr>
+          <w:b/>
+          <w:bCs/>
+        </w:rPr>
+        <w:t xml:space="preserve">Validity is limited to the drawn segments. </w:t>
+      </w:r>
+      <w:r>
+        <w:t xml:space="preserve">Each equation may only be evaluated within the extent given in the last column — the figure caption explicitly warns that extending the lines could give erroneous predictions.</w:t>
+      </w:r>
+    </w:p>
+    <w:p>
+      <w:pPr>
+        <w:pStyle w:val="ListParagraph"/>
+        <w:numPr>
+          <w:ilvl w:val="0"/>
+          <w:numId w:val="2"/>
+        </w:numPr>
+        <w:spacing w:after="80"/>
+      </w:pPr>
+      <w:r>
+        <w:rPr>
+          <w:b/>
+          <w:bCs/>
+        </w:rPr>
+        <w:t xml:space="preserve">The app does not use the a + b form internally. </w:t>
+      </w:r>
+      <w:r>
+        <w:t xml:space="preserve">The application works directly with the endpoints and interpolates by signed perpendicular distance between neighbouring lines, which handles the curved FN 0 boundary and the nonuniform FN steps (2-steps up to FN 30, then 5-steps) uniformly.</w:t>
+      </w:r>
+    </w:p>
+    <w:p>
+      <w:pPr>
+        <w:pStyle w:val="Heading1"/>
       </w:pPr>
       <w:r>
         <w:t xml:space="preserve">References</w:t>
@@ -2443,7 +6175,7 @@
       <w:r>
         <w:t xml:space="preserve">, 71(5), 171s–178s. </w:t>
       </w:r>
-      <w:hyperlink w:history="1" r:id="rId145wzldqqlowrob2znpvb">
+      <w:hyperlink w:history="1" r:id="rIdmwfvyxvrg3quzpbc9uwgf">
         <w:r>
           <w:rPr>
             <w:rStyle w:val="Hyperlink"/>
@@ -2511,7 +6243,7 @@
       <w:r>
         <w:t xml:space="preserve"> (scripts/digitize/), deployed at </w:t>
       </w:r>
-      <w:hyperlink w:history="1" r:id="rIdi41q3p_k6isyq2ltc1gck">
+      <w:hyperlink w:history="1" r:id="rIduweo-2q19xyoyzoqjtgii">
         <w:r>
           <w:rPr>
             <w:rStyle w:val="Hyperlink"/>

</xml_diff>